<commit_message>
tweak template and pipe in long desc of agency in header
</commit_message>
<xml_diff>
--- a/backend/templates/continuation-report/CDOGS-CR_TEMPLATE-v1.docx
+++ b/backend/templates/continuation-report/CDOGS-CR_TEMPLATE-v1.docx
@@ -13,7 +13,38 @@
           <w:sz w:val="24"/>
           <w:szCs w:val="24"/>
         </w:rPr>
-        <w:t>CONSERVATION OFFICER SERVICE CONTINUATION REPORT</w:t>
+        <w:t>{</w:t>
+      </w:r>
+      <w:proofErr w:type="spellStart"/>
+      <w:proofErr w:type="gramStart"/>
+      <w:r>
+        <w:rPr>
+          <w:b/>
+          <w:bCs/>
+          <w:sz w:val="24"/>
+          <w:szCs w:val="24"/>
+        </w:rPr>
+        <w:t>d.agencyName</w:t>
+      </w:r>
+      <w:proofErr w:type="spellEnd"/>
+      <w:proofErr w:type="gramEnd"/>
+      <w:r>
+        <w:rPr>
+          <w:b/>
+          <w:bCs/>
+          <w:sz w:val="24"/>
+          <w:szCs w:val="24"/>
+        </w:rPr>
+        <w:t>}</w:t>
+      </w:r>
+      <w:r>
+        <w:rPr>
+          <w:b/>
+          <w:bCs/>
+          <w:sz w:val="24"/>
+          <w:szCs w:val="24"/>
+        </w:rPr>
+        <w:t xml:space="preserve"> CONTINUATION REPORT</w:t>
       </w:r>
     </w:p>
     <w:p>
@@ -525,18 +556,34 @@
               <w:t>actionedDate</w:t>
             </w:r>
             <w:proofErr w:type="spellEnd"/>
-            <w:proofErr w:type="gramEnd"/>
-            <w:r>
-              <w:rPr>
-                <w:rFonts w:ascii="BC Sans" w:eastAsia="Times New Roman" w:hAnsi="BC Sans" w:cs="Times New Roman"/>
-                <w:color w:val="000000" w:themeColor="text1"/>
-                <w:sz w:val="18"/>
-                <w:szCs w:val="18"/>
-              </w:rPr>
-              <w:t>} {</w:t>
+            <w:r>
+              <w:rPr>
+                <w:rFonts w:ascii="BC Sans" w:eastAsia="Times New Roman" w:hAnsi="BC Sans" w:cs="Times New Roman"/>
+                <w:color w:val="000000" w:themeColor="text1"/>
+                <w:sz w:val="18"/>
+                <w:szCs w:val="18"/>
+              </w:rPr>
+              <w:t xml:space="preserve">} </w:t>
+            </w:r>
+            <w:r>
+              <w:rPr>
+                <w:rFonts w:ascii="BC Sans" w:eastAsia="Times New Roman" w:hAnsi="BC Sans" w:cs="Times New Roman"/>
+                <w:color w:val="000000" w:themeColor="text1"/>
+                <w:sz w:val="18"/>
+                <w:szCs w:val="18"/>
+              </w:rPr>
+              <w:t xml:space="preserve"> </w:t>
+            </w:r>
+            <w:r>
+              <w:rPr>
+                <w:rFonts w:ascii="BC Sans" w:eastAsia="Times New Roman" w:hAnsi="BC Sans" w:cs="Times New Roman"/>
+                <w:color w:val="000000" w:themeColor="text1"/>
+                <w:sz w:val="18"/>
+                <w:szCs w:val="18"/>
+              </w:rPr>
+              <w:t>{</w:t>
             </w:r>
             <w:proofErr w:type="spellStart"/>
-            <w:proofErr w:type="gramStart"/>
             <w:r>
               <w:rPr>
                 <w:rFonts w:ascii="BC Sans" w:eastAsia="Times New Roman" w:hAnsi="BC Sans" w:cs="Times New Roman"/>
@@ -972,18 +1019,34 @@
               <w:t>actionedDate</w:t>
             </w:r>
             <w:proofErr w:type="spellEnd"/>
-            <w:proofErr w:type="gramEnd"/>
-            <w:r>
-              <w:rPr>
-                <w:rFonts w:ascii="BC Sans" w:eastAsia="Times New Roman" w:hAnsi="BC Sans" w:cs="Times New Roman"/>
-                <w:color w:val="000000" w:themeColor="text1"/>
-                <w:sz w:val="18"/>
-                <w:szCs w:val="18"/>
-              </w:rPr>
-              <w:t>} {</w:t>
+            <w:r>
+              <w:rPr>
+                <w:rFonts w:ascii="BC Sans" w:eastAsia="Times New Roman" w:hAnsi="BC Sans" w:cs="Times New Roman"/>
+                <w:color w:val="000000" w:themeColor="text1"/>
+                <w:sz w:val="18"/>
+                <w:szCs w:val="18"/>
+              </w:rPr>
+              <w:t xml:space="preserve">} </w:t>
+            </w:r>
+            <w:r>
+              <w:rPr>
+                <w:rFonts w:ascii="BC Sans" w:eastAsia="Times New Roman" w:hAnsi="BC Sans" w:cs="Times New Roman"/>
+                <w:color w:val="000000" w:themeColor="text1"/>
+                <w:sz w:val="18"/>
+                <w:szCs w:val="18"/>
+              </w:rPr>
+              <w:t xml:space="preserve"> </w:t>
+            </w:r>
+            <w:r>
+              <w:rPr>
+                <w:rFonts w:ascii="BC Sans" w:eastAsia="Times New Roman" w:hAnsi="BC Sans" w:cs="Times New Roman"/>
+                <w:color w:val="000000" w:themeColor="text1"/>
+                <w:sz w:val="18"/>
+                <w:szCs w:val="18"/>
+              </w:rPr>
+              <w:t>{</w:t>
             </w:r>
             <w:proofErr w:type="spellStart"/>
-            <w:proofErr w:type="gramStart"/>
             <w:r>
               <w:rPr>
                 <w:rFonts w:ascii="BC Sans" w:eastAsia="Times New Roman" w:hAnsi="BC Sans" w:cs="Times New Roman"/>

</xml_diff>

<commit_message>
cr template feedback tweaks
</commit_message>
<xml_diff>
--- a/backend/templates/continuation-report/CDOGS-CR_TEMPLATE-v1.docx
+++ b/backend/templates/continuation-report/CDOGS-CR_TEMPLATE-v1.docx
@@ -5,6 +5,12 @@
     <w:p>
       <w:pPr>
         <w:spacing w:after="80"/>
+        <w:rPr>
+          <w:b/>
+          <w:bCs/>
+          <w:sz w:val="24"/>
+          <w:szCs w:val="24"/>
+        </w:rPr>
       </w:pPr>
       <w:r>
         <w:rPr>
@@ -49,200 +55,124 @@
     </w:p>
     <w:p>
       <w:pPr>
-        <w:pBdr>
-          <w:bottom w:val="single" w:sz="4" w:space="0" w:color="000000"/>
-        </w:pBdr>
+        <w:spacing w:after="80"/>
+        <w:rPr>
+          <w:rFonts w:eastAsia="Times New Roman" w:cs="Times New Roman"/>
+          <w:color w:val="000000" w:themeColor="text1"/>
+        </w:rPr>
       </w:pPr>
     </w:p>
     <w:p>
       <w:pPr>
-        <w:spacing w:before="60" w:after="240"/>
+        <w:spacing w:after="80"/>
+        <w:rPr>
+          <w:b/>
+          <w:bCs/>
+          <w:sz w:val="24"/>
+          <w:szCs w:val="24"/>
+        </w:rPr>
       </w:pPr>
+      <w:r>
+        <w:rPr>
+          <w:rFonts w:eastAsia="Times New Roman" w:cs="Times New Roman"/>
+          <w:color w:val="000000" w:themeColor="text1"/>
+        </w:rPr>
+        <w:t>Investigation</w:t>
+      </w:r>
+      <w:r>
+        <w:rPr>
+          <w:rFonts w:eastAsia="Times New Roman" w:cs="Times New Roman"/>
+          <w:color w:val="000000" w:themeColor="text1"/>
+        </w:rPr>
+        <w:t>:</w:t>
+      </w:r>
+      <w:r>
+        <w:rPr>
+          <w:rFonts w:eastAsia="Times New Roman" w:cs="Times New Roman"/>
+          <w:color w:val="000000" w:themeColor="text1"/>
+        </w:rPr>
+        <w:t xml:space="preserve"> </w:t>
+      </w:r>
+      <w:r>
+        <w:rPr>
+          <w:rFonts w:eastAsia="Times New Roman" w:cs="Times New Roman"/>
+          <w:color w:val="000000" w:themeColor="text1"/>
+        </w:rPr>
+        <w:t>{</w:t>
+      </w:r>
+      <w:proofErr w:type="gramStart"/>
+      <w:r>
+        <w:rPr>
+          <w:rFonts w:eastAsia="Times New Roman" w:cs="Times New Roman"/>
+          <w:color w:val="000000" w:themeColor="text1"/>
+        </w:rPr>
+        <w:t>d</w:t>
+      </w:r>
+      <w:r>
+        <w:rPr>
+          <w:sz w:val="18"/>
+          <w:szCs w:val="18"/>
+        </w:rPr>
+        <w:t>.</w:t>
+      </w:r>
+      <w:r>
+        <w:rPr>
+          <w:rFonts w:eastAsia="Times New Roman" w:cs="Times New Roman"/>
+          <w:color w:val="000000" w:themeColor="text1"/>
+        </w:rPr>
+        <w:t>investigation.name</w:t>
+      </w:r>
+      <w:proofErr w:type="gramEnd"/>
+      <w:r>
+        <w:rPr>
+          <w:rFonts w:eastAsia="Times New Roman" w:cs="Times New Roman"/>
+          <w:color w:val="000000" w:themeColor="text1"/>
+        </w:rPr>
+        <w:t>}</w:t>
+      </w:r>
     </w:p>
-    <w:tbl>
-      <w:tblPr>
-        <w:tblStyle w:val="PlainTable4"/>
-        <w:tblW w:w="10980" w:type="dxa"/>
-        <w:tblLayout w:type="fixed"/>
-        <w:tblLook w:val="06A0" w:firstRow="1" w:lastRow="0" w:firstColumn="1" w:lastColumn="0" w:noHBand="1" w:noVBand="1"/>
-      </w:tblPr>
-      <w:tblGrid>
-        <w:gridCol w:w="7380"/>
-        <w:gridCol w:w="3600"/>
-      </w:tblGrid>
-      <w:tr>
-        <w:trPr>
-          <w:cnfStyle w:val="100000000000" w:firstRow="1" w:lastRow="0" w:firstColumn="0" w:lastColumn="0" w:oddVBand="0" w:evenVBand="0" w:oddHBand="0" w:evenHBand="0" w:firstRowFirstColumn="0" w:firstRowLastColumn="0" w:lastRowFirstColumn="0" w:lastRowLastColumn="0"/>
-          <w:trHeight w:val="300"/>
-        </w:trPr>
-        <w:tc>
-          <w:tcPr>
-            <w:cnfStyle w:val="001000000000" w:firstRow="0" w:lastRow="0" w:firstColumn="1" w:lastColumn="0" w:oddVBand="0" w:evenVBand="0" w:oddHBand="0" w:evenHBand="0" w:firstRowFirstColumn="0" w:firstRowLastColumn="0" w:lastRowFirstColumn="0" w:lastRowLastColumn="0"/>
-            <w:tcW w:w="7380" w:type="dxa"/>
-          </w:tcPr>
-          <w:p>
-            <w:pPr>
-              <w:rPr>
-                <w:rFonts w:ascii="BC Sans" w:eastAsia="Times New Roman" w:hAnsi="BC Sans" w:cs="Times New Roman"/>
-                <w:b w:val="0"/>
-                <w:bCs w:val="0"/>
-                <w:color w:val="000000" w:themeColor="text1"/>
-                <w:sz w:val="20"/>
-                <w:szCs w:val="20"/>
-              </w:rPr>
-            </w:pPr>
-            <w:proofErr w:type="gramStart"/>
-            <w:r>
-              <w:rPr>
-                <w:rFonts w:ascii="BC Sans" w:eastAsia="Times New Roman" w:hAnsi="BC Sans" w:cs="Times New Roman"/>
-                <w:b w:val="0"/>
-                <w:bCs w:val="0"/>
-                <w:color w:val="000000" w:themeColor="text1"/>
-                <w:sz w:val="20"/>
-                <w:szCs w:val="20"/>
-              </w:rPr>
-              <w:t>Investigation</w:t>
-            </w:r>
-            <w:r>
-              <w:rPr>
-                <w:rFonts w:ascii="BC Sans" w:eastAsia="Times New Roman" w:hAnsi="BC Sans" w:cs="Times New Roman"/>
-                <w:b w:val="0"/>
-                <w:bCs w:val="0"/>
-                <w:color w:val="000000" w:themeColor="text1"/>
-                <w:sz w:val="20"/>
-                <w:szCs w:val="20"/>
-              </w:rPr>
-              <w:t>:</w:t>
-            </w:r>
-            <w:r>
-              <w:rPr>
-                <w:rFonts w:ascii="BC Sans" w:eastAsia="Times New Roman" w:hAnsi="BC Sans" w:cs="Times New Roman"/>
-                <w:b w:val="0"/>
-                <w:bCs w:val="0"/>
-                <w:color w:val="000000" w:themeColor="text1"/>
-                <w:sz w:val="20"/>
-                <w:szCs w:val="20"/>
-              </w:rPr>
-              <w:t xml:space="preserve"> </w:t>
-            </w:r>
-            <w:r>
-              <w:rPr>
-                <w:rFonts w:ascii="BC Sans" w:eastAsia="Times New Roman" w:hAnsi="BC Sans" w:cs="Times New Roman"/>
-                <w:b w:val="0"/>
-                <w:bCs w:val="0"/>
-                <w:color w:val="000000" w:themeColor="text1"/>
-                <w:sz w:val="20"/>
-                <w:szCs w:val="20"/>
-              </w:rPr>
-              <w:t>{</w:t>
-            </w:r>
-            <w:r>
-              <w:rPr>
-                <w:rFonts w:ascii="BC Sans" w:eastAsia="Times New Roman" w:hAnsi="BC Sans" w:cs="Times New Roman"/>
-                <w:b w:val="0"/>
-                <w:bCs w:val="0"/>
-                <w:color w:val="000000" w:themeColor="text1"/>
-                <w:sz w:val="20"/>
-                <w:szCs w:val="20"/>
-              </w:rPr>
-              <w:t>d</w:t>
-            </w:r>
-            <w:r>
-              <w:rPr>
-                <w:rFonts w:ascii="BC Sans" w:eastAsia="BC Sans" w:hAnsi="BC Sans" w:cs="BC Sans"/>
-                <w:sz w:val="18"/>
-                <w:szCs w:val="18"/>
-              </w:rPr>
-              <w:t>.</w:t>
-            </w:r>
-            <w:r>
-              <w:rPr>
-                <w:rFonts w:ascii="BC Sans" w:eastAsia="Times New Roman" w:hAnsi="BC Sans" w:cs="Times New Roman"/>
-                <w:b w:val="0"/>
-                <w:bCs w:val="0"/>
-                <w:color w:val="000000" w:themeColor="text1"/>
-                <w:sz w:val="20"/>
-                <w:szCs w:val="20"/>
-              </w:rPr>
-              <w:t>investigation.name</w:t>
-            </w:r>
-            <w:proofErr w:type="gramEnd"/>
-            <w:r>
-              <w:rPr>
-                <w:rFonts w:ascii="BC Sans" w:eastAsia="Times New Roman" w:hAnsi="BC Sans" w:cs="Times New Roman"/>
-                <w:b w:val="0"/>
-                <w:bCs w:val="0"/>
-                <w:color w:val="000000" w:themeColor="text1"/>
-                <w:sz w:val="20"/>
-                <w:szCs w:val="20"/>
-              </w:rPr>
-              <w:t>}</w:t>
-            </w:r>
-          </w:p>
-        </w:tc>
-        <w:tc>
-          <w:tcPr>
-            <w:tcW w:w="3600" w:type="dxa"/>
-          </w:tcPr>
-          <w:p>
-            <w:pPr>
-              <w:cnfStyle w:val="100000000000" w:firstRow="1" w:lastRow="0" w:firstColumn="0" w:lastColumn="0" w:oddVBand="0" w:evenVBand="0" w:oddHBand="0" w:evenHBand="0" w:firstRowFirstColumn="0" w:firstRowLastColumn="0" w:lastRowFirstColumn="0" w:lastRowLastColumn="0"/>
-            </w:pPr>
-            <w:proofErr w:type="gramStart"/>
-            <w:r>
-              <w:rPr>
-                <w:rFonts w:ascii="BC Sans" w:eastAsia="Times New Roman" w:hAnsi="BC Sans" w:cs="Times New Roman"/>
-                <w:b w:val="0"/>
-                <w:bCs w:val="0"/>
-                <w:color w:val="000000" w:themeColor="text1"/>
-                <w:sz w:val="20"/>
-                <w:szCs w:val="20"/>
-              </w:rPr>
-              <w:t>Description: {</w:t>
-            </w:r>
-            <w:proofErr w:type="spellStart"/>
-            <w:r>
-              <w:rPr>
-                <w:rFonts w:ascii="BC Sans" w:eastAsia="Times New Roman" w:hAnsi="BC Sans" w:cs="Times New Roman"/>
-                <w:b w:val="0"/>
-                <w:bCs w:val="0"/>
-                <w:color w:val="000000" w:themeColor="text1"/>
-                <w:sz w:val="20"/>
-                <w:szCs w:val="20"/>
-              </w:rPr>
-              <w:t>d.investigation</w:t>
-            </w:r>
-            <w:proofErr w:type="gramEnd"/>
-            <w:r>
-              <w:rPr>
-                <w:rFonts w:ascii="BC Sans" w:eastAsia="Times New Roman" w:hAnsi="BC Sans" w:cs="Times New Roman"/>
-                <w:b w:val="0"/>
-                <w:bCs w:val="0"/>
-                <w:color w:val="000000" w:themeColor="text1"/>
-                <w:sz w:val="20"/>
-                <w:szCs w:val="20"/>
-              </w:rPr>
-              <w:t>.description</w:t>
-            </w:r>
-            <w:proofErr w:type="spellEnd"/>
-            <w:r>
-              <w:rPr>
-                <w:rFonts w:ascii="BC Sans" w:eastAsia="Times New Roman" w:hAnsi="BC Sans" w:cs="Times New Roman"/>
-                <w:b w:val="0"/>
-                <w:bCs w:val="0"/>
-                <w:color w:val="000000" w:themeColor="text1"/>
-                <w:sz w:val="20"/>
-                <w:szCs w:val="20"/>
-              </w:rPr>
-              <w:t>}</w:t>
-            </w:r>
-          </w:p>
-        </w:tc>
-      </w:tr>
-    </w:tbl>
     <w:p>
       <w:pPr>
-        <w:spacing w:before="60" w:after="240"/>
+        <w:spacing w:after="80"/>
+      </w:pPr>
+      <w:r>
+        <w:rPr>
+          <w:rFonts w:eastAsia="Times New Roman" w:cs="Times New Roman"/>
+          <w:color w:val="000000" w:themeColor="text1"/>
+        </w:rPr>
+        <w:t>Description: {</w:t>
+      </w:r>
+      <w:proofErr w:type="spellStart"/>
+      <w:proofErr w:type="gramStart"/>
+      <w:r>
+        <w:rPr>
+          <w:rFonts w:eastAsia="Times New Roman" w:cs="Times New Roman"/>
+          <w:color w:val="000000" w:themeColor="text1"/>
+        </w:rPr>
+        <w:t>d.investigation</w:t>
+      </w:r>
+      <w:proofErr w:type="gramEnd"/>
+      <w:r>
+        <w:rPr>
+          <w:rFonts w:eastAsia="Times New Roman" w:cs="Times New Roman"/>
+          <w:color w:val="000000" w:themeColor="text1"/>
+        </w:rPr>
+        <w:t>.description</w:t>
+      </w:r>
+      <w:proofErr w:type="spellEnd"/>
+      <w:r>
+        <w:rPr>
+          <w:rFonts w:eastAsia="Times New Roman" w:cs="Times New Roman"/>
+          <w:color w:val="000000" w:themeColor="text1"/>
+        </w:rPr>
+        <w:t>}</w:t>
+      </w:r>
+    </w:p>
+    <w:p>
+      <w:pPr>
+        <w:pBdr>
+          <w:bottom w:val="single" w:sz="4" w:space="0" w:color="000000"/>
+        </w:pBdr>
       </w:pPr>
     </w:p>
     <w:p>

</xml_diff>

<commit_message>
fix: CE-2356 fix task links (#1533)
Co-authored-by: afwilcox <alecwilcox@gmail.com>
Co-authored-by: team-wolverine-nrm-repo-updater[bot] <203337993+team-wolverine-nrm-repo-updater[bot]@users.noreply.github.com>
</commit_message>
<xml_diff>
--- a/backend/templates/continuation-report/CDOGS-CR_TEMPLATE-v1.docx
+++ b/backend/templates/continuation-report/CDOGS-CR_TEMPLATE-v1.docx
@@ -5,6 +5,12 @@
     <w:p>
       <w:pPr>
         <w:spacing w:after="80"/>
+        <w:rPr>
+          <w:b/>
+          <w:bCs/>
+          <w:sz w:val="24"/>
+          <w:szCs w:val="24"/>
+        </w:rPr>
       </w:pPr>
       <w:r>
         <w:rPr>
@@ -49,200 +55,124 @@
     </w:p>
     <w:p>
       <w:pPr>
-        <w:pBdr>
-          <w:bottom w:val="single" w:sz="4" w:space="0" w:color="000000"/>
-        </w:pBdr>
+        <w:spacing w:after="80"/>
+        <w:rPr>
+          <w:rFonts w:eastAsia="Times New Roman" w:cs="Times New Roman"/>
+          <w:color w:val="000000" w:themeColor="text1"/>
+        </w:rPr>
       </w:pPr>
     </w:p>
     <w:p>
       <w:pPr>
-        <w:spacing w:before="60" w:after="240"/>
+        <w:spacing w:after="80"/>
+        <w:rPr>
+          <w:b/>
+          <w:bCs/>
+          <w:sz w:val="24"/>
+          <w:szCs w:val="24"/>
+        </w:rPr>
       </w:pPr>
+      <w:r>
+        <w:rPr>
+          <w:rFonts w:eastAsia="Times New Roman" w:cs="Times New Roman"/>
+          <w:color w:val="000000" w:themeColor="text1"/>
+        </w:rPr>
+        <w:t>Investigation</w:t>
+      </w:r>
+      <w:r>
+        <w:rPr>
+          <w:rFonts w:eastAsia="Times New Roman" w:cs="Times New Roman"/>
+          <w:color w:val="000000" w:themeColor="text1"/>
+        </w:rPr>
+        <w:t>:</w:t>
+      </w:r>
+      <w:r>
+        <w:rPr>
+          <w:rFonts w:eastAsia="Times New Roman" w:cs="Times New Roman"/>
+          <w:color w:val="000000" w:themeColor="text1"/>
+        </w:rPr>
+        <w:t xml:space="preserve"> </w:t>
+      </w:r>
+      <w:r>
+        <w:rPr>
+          <w:rFonts w:eastAsia="Times New Roman" w:cs="Times New Roman"/>
+          <w:color w:val="000000" w:themeColor="text1"/>
+        </w:rPr>
+        <w:t>{</w:t>
+      </w:r>
+      <w:proofErr w:type="gramStart"/>
+      <w:r>
+        <w:rPr>
+          <w:rFonts w:eastAsia="Times New Roman" w:cs="Times New Roman"/>
+          <w:color w:val="000000" w:themeColor="text1"/>
+        </w:rPr>
+        <w:t>d</w:t>
+      </w:r>
+      <w:r>
+        <w:rPr>
+          <w:sz w:val="18"/>
+          <w:szCs w:val="18"/>
+        </w:rPr>
+        <w:t>.</w:t>
+      </w:r>
+      <w:r>
+        <w:rPr>
+          <w:rFonts w:eastAsia="Times New Roman" w:cs="Times New Roman"/>
+          <w:color w:val="000000" w:themeColor="text1"/>
+        </w:rPr>
+        <w:t>investigation.name</w:t>
+      </w:r>
+      <w:proofErr w:type="gramEnd"/>
+      <w:r>
+        <w:rPr>
+          <w:rFonts w:eastAsia="Times New Roman" w:cs="Times New Roman"/>
+          <w:color w:val="000000" w:themeColor="text1"/>
+        </w:rPr>
+        <w:t>}</w:t>
+      </w:r>
     </w:p>
-    <w:tbl>
-      <w:tblPr>
-        <w:tblStyle w:val="PlainTable4"/>
-        <w:tblW w:w="10980" w:type="dxa"/>
-        <w:tblLayout w:type="fixed"/>
-        <w:tblLook w:val="06A0" w:firstRow="1" w:lastRow="0" w:firstColumn="1" w:lastColumn="0" w:noHBand="1" w:noVBand="1"/>
-      </w:tblPr>
-      <w:tblGrid>
-        <w:gridCol w:w="7380"/>
-        <w:gridCol w:w="3600"/>
-      </w:tblGrid>
-      <w:tr>
-        <w:trPr>
-          <w:cnfStyle w:val="100000000000" w:firstRow="1" w:lastRow="0" w:firstColumn="0" w:lastColumn="0" w:oddVBand="0" w:evenVBand="0" w:oddHBand="0" w:evenHBand="0" w:firstRowFirstColumn="0" w:firstRowLastColumn="0" w:lastRowFirstColumn="0" w:lastRowLastColumn="0"/>
-          <w:trHeight w:val="300"/>
-        </w:trPr>
-        <w:tc>
-          <w:tcPr>
-            <w:cnfStyle w:val="001000000000" w:firstRow="0" w:lastRow="0" w:firstColumn="1" w:lastColumn="0" w:oddVBand="0" w:evenVBand="0" w:oddHBand="0" w:evenHBand="0" w:firstRowFirstColumn="0" w:firstRowLastColumn="0" w:lastRowFirstColumn="0" w:lastRowLastColumn="0"/>
-            <w:tcW w:w="7380" w:type="dxa"/>
-          </w:tcPr>
-          <w:p>
-            <w:pPr>
-              <w:rPr>
-                <w:rFonts w:ascii="BC Sans" w:eastAsia="Times New Roman" w:hAnsi="BC Sans" w:cs="Times New Roman"/>
-                <w:b w:val="0"/>
-                <w:bCs w:val="0"/>
-                <w:color w:val="000000" w:themeColor="text1"/>
-                <w:sz w:val="20"/>
-                <w:szCs w:val="20"/>
-              </w:rPr>
-            </w:pPr>
-            <w:proofErr w:type="gramStart"/>
-            <w:r>
-              <w:rPr>
-                <w:rFonts w:ascii="BC Sans" w:eastAsia="Times New Roman" w:hAnsi="BC Sans" w:cs="Times New Roman"/>
-                <w:b w:val="0"/>
-                <w:bCs w:val="0"/>
-                <w:color w:val="000000" w:themeColor="text1"/>
-                <w:sz w:val="20"/>
-                <w:szCs w:val="20"/>
-              </w:rPr>
-              <w:t>Investigation</w:t>
-            </w:r>
-            <w:r>
-              <w:rPr>
-                <w:rFonts w:ascii="BC Sans" w:eastAsia="Times New Roman" w:hAnsi="BC Sans" w:cs="Times New Roman"/>
-                <w:b w:val="0"/>
-                <w:bCs w:val="0"/>
-                <w:color w:val="000000" w:themeColor="text1"/>
-                <w:sz w:val="20"/>
-                <w:szCs w:val="20"/>
-              </w:rPr>
-              <w:t>:</w:t>
-            </w:r>
-            <w:r>
-              <w:rPr>
-                <w:rFonts w:ascii="BC Sans" w:eastAsia="Times New Roman" w:hAnsi="BC Sans" w:cs="Times New Roman"/>
-                <w:b w:val="0"/>
-                <w:bCs w:val="0"/>
-                <w:color w:val="000000" w:themeColor="text1"/>
-                <w:sz w:val="20"/>
-                <w:szCs w:val="20"/>
-              </w:rPr>
-              <w:t xml:space="preserve"> </w:t>
-            </w:r>
-            <w:r>
-              <w:rPr>
-                <w:rFonts w:ascii="BC Sans" w:eastAsia="Times New Roman" w:hAnsi="BC Sans" w:cs="Times New Roman"/>
-                <w:b w:val="0"/>
-                <w:bCs w:val="0"/>
-                <w:color w:val="000000" w:themeColor="text1"/>
-                <w:sz w:val="20"/>
-                <w:szCs w:val="20"/>
-              </w:rPr>
-              <w:t>{</w:t>
-            </w:r>
-            <w:r>
-              <w:rPr>
-                <w:rFonts w:ascii="BC Sans" w:eastAsia="Times New Roman" w:hAnsi="BC Sans" w:cs="Times New Roman"/>
-                <w:b w:val="0"/>
-                <w:bCs w:val="0"/>
-                <w:color w:val="000000" w:themeColor="text1"/>
-                <w:sz w:val="20"/>
-                <w:szCs w:val="20"/>
-              </w:rPr>
-              <w:t>d</w:t>
-            </w:r>
-            <w:r>
-              <w:rPr>
-                <w:rFonts w:ascii="BC Sans" w:eastAsia="BC Sans" w:hAnsi="BC Sans" w:cs="BC Sans"/>
-                <w:sz w:val="18"/>
-                <w:szCs w:val="18"/>
-              </w:rPr>
-              <w:t>.</w:t>
-            </w:r>
-            <w:r>
-              <w:rPr>
-                <w:rFonts w:ascii="BC Sans" w:eastAsia="Times New Roman" w:hAnsi="BC Sans" w:cs="Times New Roman"/>
-                <w:b w:val="0"/>
-                <w:bCs w:val="0"/>
-                <w:color w:val="000000" w:themeColor="text1"/>
-                <w:sz w:val="20"/>
-                <w:szCs w:val="20"/>
-              </w:rPr>
-              <w:t>investigation.name</w:t>
-            </w:r>
-            <w:proofErr w:type="gramEnd"/>
-            <w:r>
-              <w:rPr>
-                <w:rFonts w:ascii="BC Sans" w:eastAsia="Times New Roman" w:hAnsi="BC Sans" w:cs="Times New Roman"/>
-                <w:b w:val="0"/>
-                <w:bCs w:val="0"/>
-                <w:color w:val="000000" w:themeColor="text1"/>
-                <w:sz w:val="20"/>
-                <w:szCs w:val="20"/>
-              </w:rPr>
-              <w:t>}</w:t>
-            </w:r>
-          </w:p>
-        </w:tc>
-        <w:tc>
-          <w:tcPr>
-            <w:tcW w:w="3600" w:type="dxa"/>
-          </w:tcPr>
-          <w:p>
-            <w:pPr>
-              <w:cnfStyle w:val="100000000000" w:firstRow="1" w:lastRow="0" w:firstColumn="0" w:lastColumn="0" w:oddVBand="0" w:evenVBand="0" w:oddHBand="0" w:evenHBand="0" w:firstRowFirstColumn="0" w:firstRowLastColumn="0" w:lastRowFirstColumn="0" w:lastRowLastColumn="0"/>
-            </w:pPr>
-            <w:proofErr w:type="gramStart"/>
-            <w:r>
-              <w:rPr>
-                <w:rFonts w:ascii="BC Sans" w:eastAsia="Times New Roman" w:hAnsi="BC Sans" w:cs="Times New Roman"/>
-                <w:b w:val="0"/>
-                <w:bCs w:val="0"/>
-                <w:color w:val="000000" w:themeColor="text1"/>
-                <w:sz w:val="20"/>
-                <w:szCs w:val="20"/>
-              </w:rPr>
-              <w:t>Description: {</w:t>
-            </w:r>
-            <w:proofErr w:type="spellStart"/>
-            <w:r>
-              <w:rPr>
-                <w:rFonts w:ascii="BC Sans" w:eastAsia="Times New Roman" w:hAnsi="BC Sans" w:cs="Times New Roman"/>
-                <w:b w:val="0"/>
-                <w:bCs w:val="0"/>
-                <w:color w:val="000000" w:themeColor="text1"/>
-                <w:sz w:val="20"/>
-                <w:szCs w:val="20"/>
-              </w:rPr>
-              <w:t>d.investigation</w:t>
-            </w:r>
-            <w:proofErr w:type="gramEnd"/>
-            <w:r>
-              <w:rPr>
-                <w:rFonts w:ascii="BC Sans" w:eastAsia="Times New Roman" w:hAnsi="BC Sans" w:cs="Times New Roman"/>
-                <w:b w:val="0"/>
-                <w:bCs w:val="0"/>
-                <w:color w:val="000000" w:themeColor="text1"/>
-                <w:sz w:val="20"/>
-                <w:szCs w:val="20"/>
-              </w:rPr>
-              <w:t>.description</w:t>
-            </w:r>
-            <w:proofErr w:type="spellEnd"/>
-            <w:r>
-              <w:rPr>
-                <w:rFonts w:ascii="BC Sans" w:eastAsia="Times New Roman" w:hAnsi="BC Sans" w:cs="Times New Roman"/>
-                <w:b w:val="0"/>
-                <w:bCs w:val="0"/>
-                <w:color w:val="000000" w:themeColor="text1"/>
-                <w:sz w:val="20"/>
-                <w:szCs w:val="20"/>
-              </w:rPr>
-              <w:t>}</w:t>
-            </w:r>
-          </w:p>
-        </w:tc>
-      </w:tr>
-    </w:tbl>
     <w:p>
       <w:pPr>
-        <w:spacing w:before="60" w:after="240"/>
+        <w:spacing w:after="80"/>
+      </w:pPr>
+      <w:r>
+        <w:rPr>
+          <w:rFonts w:eastAsia="Times New Roman" w:cs="Times New Roman"/>
+          <w:color w:val="000000" w:themeColor="text1"/>
+        </w:rPr>
+        <w:t>Description: {</w:t>
+      </w:r>
+      <w:proofErr w:type="spellStart"/>
+      <w:proofErr w:type="gramStart"/>
+      <w:r>
+        <w:rPr>
+          <w:rFonts w:eastAsia="Times New Roman" w:cs="Times New Roman"/>
+          <w:color w:val="000000" w:themeColor="text1"/>
+        </w:rPr>
+        <w:t>d.investigation</w:t>
+      </w:r>
+      <w:proofErr w:type="gramEnd"/>
+      <w:r>
+        <w:rPr>
+          <w:rFonts w:eastAsia="Times New Roman" w:cs="Times New Roman"/>
+          <w:color w:val="000000" w:themeColor="text1"/>
+        </w:rPr>
+        <w:t>.description</w:t>
+      </w:r>
+      <w:proofErr w:type="spellEnd"/>
+      <w:r>
+        <w:rPr>
+          <w:rFonts w:eastAsia="Times New Roman" w:cs="Times New Roman"/>
+          <w:color w:val="000000" w:themeColor="text1"/>
+        </w:rPr>
+        <w:t>}</w:t>
+      </w:r>
+    </w:p>
+    <w:p>
+      <w:pPr>
+        <w:pBdr>
+          <w:bottom w:val="single" w:sz="4" w:space="0" w:color="000000"/>
+        </w:pBdr>
       </w:pPr>
     </w:p>
     <w:p>
@@ -257,9 +187,9 @@
         <w:tblLook w:val="04A0" w:firstRow="1" w:lastRow="0" w:firstColumn="1" w:lastColumn="0" w:noHBand="0" w:noVBand="1"/>
       </w:tblPr>
       <w:tblGrid>
-        <w:gridCol w:w="6493"/>
-        <w:gridCol w:w="2586"/>
-        <w:gridCol w:w="1721"/>
+        <w:gridCol w:w="3124"/>
+        <w:gridCol w:w="5797"/>
+        <w:gridCol w:w="1879"/>
       </w:tblGrid>
       <w:tr>
         <w:trPr>
@@ -269,7 +199,7 @@
         <w:tc>
           <w:tcPr>
             <w:cnfStyle w:val="001000000100" w:firstRow="0" w:lastRow="0" w:firstColumn="1" w:lastColumn="0" w:oddVBand="0" w:evenVBand="0" w:oddHBand="0" w:evenHBand="0" w:firstRowFirstColumn="1" w:firstRowLastColumn="0" w:lastRowFirstColumn="0" w:lastRowLastColumn="0"/>
-            <w:tcW w:w="7549" w:type="dxa"/>
+            <w:tcW w:w="2835" w:type="dxa"/>
           </w:tcPr>
           <w:p>
             <w:pPr>
@@ -293,13 +223,13 @@
                 <w:szCs w:val="20"/>
                 <w14:ligatures w14:val="none"/>
               </w:rPr>
-              <w:t>Continuation Report</w:t>
+              <w:t>Date/time actioned</w:t>
             </w:r>
           </w:p>
         </w:tc>
         <w:tc>
           <w:tcPr>
-            <w:tcW w:w="1181" w:type="dxa"/>
+            <w:tcW w:w="6117" w:type="dxa"/>
           </w:tcPr>
           <w:p>
             <w:pPr>
@@ -324,13 +254,13 @@
                 <w:szCs w:val="20"/>
                 <w14:ligatures w14:val="none"/>
               </w:rPr>
-              <w:t>Date/time actioned</w:t>
+              <w:t>Continuation Report</w:t>
             </w:r>
           </w:p>
         </w:tc>
         <w:tc>
           <w:tcPr>
-            <w:tcW w:w="2070" w:type="dxa"/>
+            <w:tcW w:w="1848" w:type="dxa"/>
           </w:tcPr>
           <w:p>
             <w:pPr>
@@ -368,7 +298,7 @@
         <w:tc>
           <w:tcPr>
             <w:cnfStyle w:val="001000000000" w:firstRow="0" w:lastRow="0" w:firstColumn="1" w:lastColumn="0" w:oddVBand="0" w:evenVBand="0" w:oddHBand="0" w:evenHBand="0" w:firstRowFirstColumn="0" w:firstRowLastColumn="0" w:lastRowFirstColumn="0" w:lastRowLastColumn="0"/>
-            <w:tcW w:w="7549" w:type="dxa"/>
+            <w:tcW w:w="2835" w:type="dxa"/>
             <w:noWrap/>
             <w:vAlign w:val="center"/>
           </w:tcPr>
@@ -396,7 +326,6 @@
               <w:t>{</w:t>
             </w:r>
             <w:proofErr w:type="spellStart"/>
-            <w:proofErr w:type="gramStart"/>
             <w:r>
               <w:rPr>
                 <w:rFonts w:ascii="BC Sans" w:hAnsi="BC Sans"/>
@@ -409,7 +338,6 @@
               <w:t>d.activityNotes</w:t>
             </w:r>
             <w:proofErr w:type="spellEnd"/>
-            <w:proofErr w:type="gramEnd"/>
             <w:r>
               <w:rPr>
                 <w:rFonts w:ascii="BC Sans" w:hAnsi="BC Sans"/>
@@ -434,7 +362,6 @@
               <w:t>i</w:t>
             </w:r>
             <w:proofErr w:type="spellEnd"/>
-            <w:proofErr w:type="gramStart"/>
             <w:r>
               <w:rPr>
                 <w:rFonts w:ascii="BC Sans" w:hAnsi="BC Sans"/>
@@ -456,10 +383,103 @@
                 <w:sz w:val="20"/>
                 <w:szCs w:val="20"/>
               </w:rPr>
-              <w:t>contentText</w:t>
+              <w:t>actionedDate</w:t>
             </w:r>
             <w:proofErr w:type="spellEnd"/>
-            <w:proofErr w:type="gramEnd"/>
+            <w:r>
+              <w:rPr>
+                <w:rFonts w:ascii="BC Sans" w:hAnsi="BC Sans"/>
+                <w:b w:val="0"/>
+                <w:bCs w:val="0"/>
+                <w:caps w:val="0"/>
+                <w:sz w:val="20"/>
+                <w:szCs w:val="20"/>
+              </w:rPr>
+              <w:t xml:space="preserve">}  </w:t>
+            </w:r>
+            <w:r>
+              <w:rPr>
+                <w:rFonts w:ascii="BC Sans" w:hAnsi="BC Sans"/>
+                <w:b w:val="0"/>
+                <w:bCs w:val="0"/>
+                <w:caps w:val="0"/>
+                <w:sz w:val="20"/>
+                <w:szCs w:val="20"/>
+              </w:rPr>
+              <w:t xml:space="preserve"> </w:t>
+            </w:r>
+            <w:r>
+              <w:rPr>
+                <w:rFonts w:ascii="BC Sans" w:hAnsi="BC Sans"/>
+                <w:b w:val="0"/>
+                <w:bCs w:val="0"/>
+                <w:caps w:val="0"/>
+                <w:sz w:val="20"/>
+                <w:szCs w:val="20"/>
+              </w:rPr>
+              <w:t>{</w:t>
+            </w:r>
+            <w:proofErr w:type="spellStart"/>
+            <w:r>
+              <w:rPr>
+                <w:rFonts w:ascii="BC Sans" w:hAnsi="BC Sans"/>
+                <w:b w:val="0"/>
+                <w:bCs w:val="0"/>
+                <w:caps w:val="0"/>
+                <w:sz w:val="20"/>
+                <w:szCs w:val="20"/>
+              </w:rPr>
+              <w:t>d.activityNotes</w:t>
+            </w:r>
+            <w:proofErr w:type="spellEnd"/>
+            <w:r>
+              <w:rPr>
+                <w:rFonts w:ascii="BC Sans" w:hAnsi="BC Sans"/>
+                <w:b w:val="0"/>
+                <w:bCs w:val="0"/>
+                <w:caps w:val="0"/>
+                <w:sz w:val="20"/>
+                <w:szCs w:val="20"/>
+              </w:rPr>
+              <w:t>[</w:t>
+            </w:r>
+            <w:proofErr w:type="spellStart"/>
+            <w:r>
+              <w:rPr>
+                <w:rFonts w:ascii="BC Sans" w:hAnsi="BC Sans"/>
+                <w:b w:val="0"/>
+                <w:bCs w:val="0"/>
+                <w:caps w:val="0"/>
+                <w:sz w:val="20"/>
+                <w:szCs w:val="20"/>
+              </w:rPr>
+              <w:t>i</w:t>
+            </w:r>
+            <w:proofErr w:type="spellEnd"/>
+            <w:r>
+              <w:rPr>
+                <w:rFonts w:ascii="BC Sans" w:hAnsi="BC Sans"/>
+                <w:b w:val="0"/>
+                <w:bCs w:val="0"/>
+                <w:caps w:val="0"/>
+                <w:sz w:val="20"/>
+                <w:szCs w:val="20"/>
+              </w:rPr>
+              <w:t>].</w:t>
+            </w:r>
+            <w:proofErr w:type="spellStart"/>
+            <w:r>
+              <w:rPr>
+                <w:rFonts w:ascii="BC Sans" w:hAnsi="BC Sans"/>
+                <w:b w:val="0"/>
+                <w:bCs w:val="0"/>
+                <w:caps w:val="0"/>
+                <w:sz w:val="20"/>
+                <w:szCs w:val="20"/>
+              </w:rPr>
+              <w:t>actionedTime</w:t>
+            </w:r>
+            <w:proofErr w:type="spellEnd"/>
             <w:r>
               <w:rPr>
                 <w:rFonts w:ascii="BC Sans" w:hAnsi="BC Sans"/>
@@ -475,7 +495,7 @@
         </w:tc>
         <w:tc>
           <w:tcPr>
-            <w:tcW w:w="1181" w:type="dxa"/>
+            <w:tcW w:w="6117" w:type="dxa"/>
             <w:tcBorders>
               <w:right w:val="single" w:sz="4" w:space="0" w:color="7F7F7F" w:themeColor="text1" w:themeTint="80"/>
             </w:tcBorders>
@@ -495,10 +515,9 @@
             </w:pPr>
             <w:r>
               <w:rPr>
-                <w:rFonts w:ascii="BC Sans" w:eastAsia="Times New Roman" w:hAnsi="BC Sans" w:cs="Times New Roman"/>
-                <w:color w:val="000000" w:themeColor="text1"/>
-                <w:sz w:val="18"/>
-                <w:szCs w:val="18"/>
+                <w:rFonts w:ascii="BC Sans" w:hAnsi="BC Sans"/>
+                <w:sz w:val="20"/>
+                <w:szCs w:val="20"/>
               </w:rPr>
               <w:t>{</w:t>
             </w:r>
@@ -506,10 +525,9 @@
             <w:proofErr w:type="gramStart"/>
             <w:r>
               <w:rPr>
-                <w:rFonts w:ascii="BC Sans" w:eastAsia="Times New Roman" w:hAnsi="BC Sans" w:cs="Times New Roman"/>
-                <w:color w:val="000000" w:themeColor="text1"/>
-                <w:sz w:val="18"/>
-                <w:szCs w:val="18"/>
+                <w:rFonts w:ascii="BC Sans" w:hAnsi="BC Sans"/>
+                <w:sz w:val="20"/>
+                <w:szCs w:val="20"/>
               </w:rPr>
               <w:t>d.activityNotes</w:t>
             </w:r>
@@ -517,20 +535,18 @@
             <w:proofErr w:type="gramEnd"/>
             <w:r>
               <w:rPr>
-                <w:rFonts w:ascii="BC Sans" w:eastAsia="Times New Roman" w:hAnsi="BC Sans" w:cs="Times New Roman"/>
-                <w:color w:val="000000" w:themeColor="text1"/>
-                <w:sz w:val="18"/>
-                <w:szCs w:val="18"/>
+                <w:rFonts w:ascii="BC Sans" w:hAnsi="BC Sans"/>
+                <w:sz w:val="20"/>
+                <w:szCs w:val="20"/>
               </w:rPr>
               <w:t>[</w:t>
             </w:r>
             <w:proofErr w:type="spellStart"/>
             <w:r>
               <w:rPr>
-                <w:rFonts w:ascii="BC Sans" w:eastAsia="Times New Roman" w:hAnsi="BC Sans" w:cs="Times New Roman"/>
-                <w:color w:val="000000" w:themeColor="text1"/>
-                <w:sz w:val="18"/>
-                <w:szCs w:val="18"/>
+                <w:rFonts w:ascii="BC Sans" w:hAnsi="BC Sans"/>
+                <w:sz w:val="20"/>
+                <w:szCs w:val="20"/>
               </w:rPr>
               <w:t>i</w:t>
             </w:r>
@@ -538,111 +554,28 @@
             <w:proofErr w:type="gramStart"/>
             <w:r>
               <w:rPr>
-                <w:rFonts w:ascii="BC Sans" w:eastAsia="Times New Roman" w:hAnsi="BC Sans" w:cs="Times New Roman"/>
-                <w:color w:val="000000" w:themeColor="text1"/>
-                <w:sz w:val="18"/>
-                <w:szCs w:val="18"/>
+                <w:rFonts w:ascii="BC Sans" w:hAnsi="BC Sans"/>
+                <w:sz w:val="20"/>
+                <w:szCs w:val="20"/>
               </w:rPr>
               <w:t>].</w:t>
             </w:r>
             <w:proofErr w:type="spellStart"/>
             <w:r>
               <w:rPr>
-                <w:rFonts w:ascii="BC Sans" w:eastAsia="Times New Roman" w:hAnsi="BC Sans" w:cs="Times New Roman"/>
-                <w:color w:val="000000" w:themeColor="text1"/>
-                <w:sz w:val="18"/>
-                <w:szCs w:val="18"/>
-              </w:rPr>
-              <w:t>actionedDate</w:t>
-            </w:r>
-            <w:proofErr w:type="spellEnd"/>
-            <w:r>
-              <w:rPr>
-                <w:rFonts w:ascii="BC Sans" w:eastAsia="Times New Roman" w:hAnsi="BC Sans" w:cs="Times New Roman"/>
-                <w:color w:val="000000" w:themeColor="text1"/>
-                <w:sz w:val="18"/>
-                <w:szCs w:val="18"/>
-              </w:rPr>
-              <w:t xml:space="preserve">} </w:t>
-            </w:r>
-            <w:r>
-              <w:rPr>
-                <w:rFonts w:ascii="BC Sans" w:eastAsia="Times New Roman" w:hAnsi="BC Sans" w:cs="Times New Roman"/>
-                <w:color w:val="000000" w:themeColor="text1"/>
-                <w:sz w:val="18"/>
-                <w:szCs w:val="18"/>
-              </w:rPr>
-              <w:t xml:space="preserve"> </w:t>
-            </w:r>
-            <w:r>
-              <w:rPr>
-                <w:rFonts w:ascii="BC Sans" w:eastAsia="Times New Roman" w:hAnsi="BC Sans" w:cs="Times New Roman"/>
-                <w:color w:val="000000" w:themeColor="text1"/>
-                <w:sz w:val="18"/>
-                <w:szCs w:val="18"/>
-              </w:rPr>
-              <w:t>{</w:t>
-            </w:r>
-            <w:proofErr w:type="spellStart"/>
-            <w:r>
-              <w:rPr>
-                <w:rFonts w:ascii="BC Sans" w:eastAsia="Times New Roman" w:hAnsi="BC Sans" w:cs="Times New Roman"/>
-                <w:color w:val="000000" w:themeColor="text1"/>
-                <w:sz w:val="18"/>
-                <w:szCs w:val="18"/>
-              </w:rPr>
-              <w:t>d.activityNotes</w:t>
+                <w:rFonts w:ascii="BC Sans" w:hAnsi="BC Sans"/>
+                <w:sz w:val="20"/>
+                <w:szCs w:val="20"/>
+              </w:rPr>
+              <w:t>contentText</w:t>
             </w:r>
             <w:proofErr w:type="spellEnd"/>
             <w:proofErr w:type="gramEnd"/>
             <w:r>
               <w:rPr>
-                <w:rFonts w:ascii="BC Sans" w:eastAsia="Times New Roman" w:hAnsi="BC Sans" w:cs="Times New Roman"/>
-                <w:color w:val="000000" w:themeColor="text1"/>
-                <w:sz w:val="18"/>
-                <w:szCs w:val="18"/>
-              </w:rPr>
-              <w:t>[</w:t>
-            </w:r>
-            <w:proofErr w:type="spellStart"/>
-            <w:r>
-              <w:rPr>
-                <w:rFonts w:ascii="BC Sans" w:eastAsia="Times New Roman" w:hAnsi="BC Sans" w:cs="Times New Roman"/>
-                <w:color w:val="000000" w:themeColor="text1"/>
-                <w:sz w:val="18"/>
-                <w:szCs w:val="18"/>
-              </w:rPr>
-              <w:t>i</w:t>
-            </w:r>
-            <w:proofErr w:type="spellEnd"/>
-            <w:proofErr w:type="gramStart"/>
-            <w:r>
-              <w:rPr>
-                <w:rFonts w:ascii="BC Sans" w:eastAsia="Times New Roman" w:hAnsi="BC Sans" w:cs="Times New Roman"/>
-                <w:color w:val="000000" w:themeColor="text1"/>
-                <w:sz w:val="18"/>
-                <w:szCs w:val="18"/>
-              </w:rPr>
-              <w:t>].</w:t>
-            </w:r>
-            <w:proofErr w:type="spellStart"/>
-            <w:r>
-              <w:rPr>
-                <w:rFonts w:ascii="BC Sans" w:eastAsia="Times New Roman" w:hAnsi="BC Sans" w:cs="Times New Roman"/>
-                <w:color w:val="000000" w:themeColor="text1"/>
-                <w:sz w:val="18"/>
-                <w:szCs w:val="18"/>
-              </w:rPr>
-              <w:t>actionedTime</w:t>
-            </w:r>
-            <w:proofErr w:type="spellEnd"/>
-            <w:proofErr w:type="gramEnd"/>
-            <w:r>
-              <w:rPr>
-                <w:rFonts w:ascii="BC Sans" w:eastAsia="Times New Roman" w:hAnsi="BC Sans" w:cs="Times New Roman"/>
-                <w:color w:val="000000" w:themeColor="text1"/>
-                <w:sz w:val="18"/>
-                <w:szCs w:val="18"/>
+                <w:rFonts w:ascii="BC Sans" w:hAnsi="BC Sans"/>
+                <w:sz w:val="20"/>
+                <w:szCs w:val="20"/>
               </w:rPr>
               <w:t>}</w:t>
             </w:r>
@@ -650,7 +583,7 @@
         </w:tc>
         <w:tc>
           <w:tcPr>
-            <w:tcW w:w="2070" w:type="dxa"/>
+            <w:tcW w:w="1848" w:type="dxa"/>
             <w:tcBorders>
               <w:left w:val="single" w:sz="4" w:space="0" w:color="7F7F7F" w:themeColor="text1" w:themeTint="80"/>
             </w:tcBorders>
@@ -857,7 +790,7 @@
         <w:tc>
           <w:tcPr>
             <w:cnfStyle w:val="001000000000" w:firstRow="0" w:lastRow="0" w:firstColumn="1" w:lastColumn="0" w:oddVBand="0" w:evenVBand="0" w:oddHBand="0" w:evenHBand="0" w:firstRowFirstColumn="0" w:firstRowLastColumn="0" w:lastRowFirstColumn="0" w:lastRowLastColumn="0"/>
-            <w:tcW w:w="7549" w:type="dxa"/>
+            <w:tcW w:w="2835" w:type="dxa"/>
             <w:noWrap/>
             <w:vAlign w:val="center"/>
           </w:tcPr>
@@ -931,7 +864,92 @@
                 <w:sz w:val="20"/>
                 <w:szCs w:val="20"/>
               </w:rPr>
-              <w:t>contentText</w:t>
+              <w:t>actionedDate</w:t>
+            </w:r>
+            <w:proofErr w:type="spellEnd"/>
+            <w:r>
+              <w:rPr>
+                <w:rFonts w:ascii="BC Sans" w:hAnsi="BC Sans"/>
+                <w:b w:val="0"/>
+                <w:bCs w:val="0"/>
+                <w:caps w:val="0"/>
+                <w:sz w:val="20"/>
+                <w:szCs w:val="20"/>
+              </w:rPr>
+              <w:t>}</w:t>
+            </w:r>
+            <w:proofErr w:type="gramEnd"/>
+            <w:r>
+              <w:rPr>
+                <w:rFonts w:ascii="BC Sans" w:hAnsi="BC Sans"/>
+                <w:b w:val="0"/>
+                <w:bCs w:val="0"/>
+                <w:caps w:val="0"/>
+                <w:sz w:val="20"/>
+                <w:szCs w:val="20"/>
+              </w:rPr>
+              <w:t xml:space="preserve"> </w:t>
+            </w:r>
+            <w:proofErr w:type="gramStart"/>
+            <w:r>
+              <w:rPr>
+                <w:rFonts w:ascii="BC Sans" w:hAnsi="BC Sans"/>
+                <w:b w:val="0"/>
+                <w:bCs w:val="0"/>
+                <w:caps w:val="0"/>
+                <w:sz w:val="20"/>
+                <w:szCs w:val="20"/>
+              </w:rPr>
+              <w:t xml:space="preserve">  {</w:t>
+            </w:r>
+            <w:proofErr w:type="spellStart"/>
+            <w:r>
+              <w:rPr>
+                <w:rFonts w:ascii="BC Sans" w:hAnsi="BC Sans"/>
+                <w:b w:val="0"/>
+                <w:bCs w:val="0"/>
+                <w:caps w:val="0"/>
+                <w:sz w:val="20"/>
+                <w:szCs w:val="20"/>
+              </w:rPr>
+              <w:t>d.activityNotes</w:t>
+            </w:r>
+            <w:proofErr w:type="spellEnd"/>
+            <w:proofErr w:type="gramEnd"/>
+            <w:r>
+              <w:rPr>
+                <w:rFonts w:ascii="BC Sans" w:hAnsi="BC Sans"/>
+                <w:b w:val="0"/>
+                <w:bCs w:val="0"/>
+                <w:caps w:val="0"/>
+                <w:sz w:val="20"/>
+                <w:szCs w:val="20"/>
+              </w:rPr>
+              <w:t>[i+1</w:t>
+            </w:r>
+            <w:proofErr w:type="gramStart"/>
+            <w:r>
+              <w:rPr>
+                <w:rFonts w:ascii="BC Sans" w:hAnsi="BC Sans"/>
+                <w:b w:val="0"/>
+                <w:bCs w:val="0"/>
+                <w:caps w:val="0"/>
+                <w:sz w:val="20"/>
+                <w:szCs w:val="20"/>
+              </w:rPr>
+              <w:t>].</w:t>
+            </w:r>
+            <w:proofErr w:type="spellStart"/>
+            <w:r>
+              <w:rPr>
+                <w:rFonts w:ascii="BC Sans" w:hAnsi="BC Sans"/>
+                <w:b w:val="0"/>
+                <w:bCs w:val="0"/>
+                <w:caps w:val="0"/>
+                <w:sz w:val="20"/>
+                <w:szCs w:val="20"/>
+              </w:rPr>
+              <w:t>actionedTime</w:t>
             </w:r>
             <w:proofErr w:type="spellEnd"/>
             <w:proofErr w:type="gramEnd"/>
@@ -950,7 +968,7 @@
         </w:tc>
         <w:tc>
           <w:tcPr>
-            <w:tcW w:w="1181" w:type="dxa"/>
+            <w:tcW w:w="6117" w:type="dxa"/>
             <w:tcBorders>
               <w:right w:val="single" w:sz="4" w:space="0" w:color="7F7F7F" w:themeColor="text1" w:themeTint="80"/>
             </w:tcBorders>
@@ -969,10 +987,9 @@
             </w:pPr>
             <w:r>
               <w:rPr>
-                <w:rFonts w:ascii="BC Sans" w:eastAsia="Times New Roman" w:hAnsi="BC Sans" w:cs="Times New Roman"/>
-                <w:color w:val="000000" w:themeColor="text1"/>
-                <w:sz w:val="18"/>
-                <w:szCs w:val="18"/>
+                <w:rFonts w:ascii="BC Sans" w:hAnsi="BC Sans"/>
+                <w:sz w:val="20"/>
+                <w:szCs w:val="20"/>
               </w:rPr>
               <w:t>{</w:t>
             </w:r>
@@ -980,10 +997,9 @@
             <w:proofErr w:type="gramStart"/>
             <w:r>
               <w:rPr>
-                <w:rFonts w:ascii="BC Sans" w:eastAsia="Times New Roman" w:hAnsi="BC Sans" w:cs="Times New Roman"/>
-                <w:color w:val="000000" w:themeColor="text1"/>
-                <w:sz w:val="18"/>
-                <w:szCs w:val="18"/>
+                <w:rFonts w:ascii="BC Sans" w:hAnsi="BC Sans"/>
+                <w:sz w:val="20"/>
+                <w:szCs w:val="20"/>
               </w:rPr>
               <w:t>d.activityNotes</w:t>
             </w:r>
@@ -991,110 +1007,37 @@
             <w:proofErr w:type="gramEnd"/>
             <w:r>
               <w:rPr>
-                <w:rFonts w:ascii="BC Sans" w:eastAsia="Times New Roman" w:hAnsi="BC Sans" w:cs="Times New Roman"/>
-                <w:color w:val="000000" w:themeColor="text1"/>
-                <w:sz w:val="18"/>
-                <w:szCs w:val="18"/>
+                <w:rFonts w:ascii="BC Sans" w:hAnsi="BC Sans"/>
+                <w:sz w:val="20"/>
+                <w:szCs w:val="20"/>
               </w:rPr>
               <w:t>[i+1</w:t>
             </w:r>
             <w:proofErr w:type="gramStart"/>
             <w:r>
               <w:rPr>
-                <w:rFonts w:ascii="BC Sans" w:eastAsia="Times New Roman" w:hAnsi="BC Sans" w:cs="Times New Roman"/>
-                <w:color w:val="000000" w:themeColor="text1"/>
-                <w:sz w:val="18"/>
-                <w:szCs w:val="18"/>
+                <w:rFonts w:ascii="BC Sans" w:hAnsi="BC Sans"/>
+                <w:sz w:val="20"/>
+                <w:szCs w:val="20"/>
               </w:rPr>
               <w:t>].</w:t>
             </w:r>
             <w:proofErr w:type="spellStart"/>
             <w:r>
               <w:rPr>
-                <w:rFonts w:ascii="BC Sans" w:eastAsia="Times New Roman" w:hAnsi="BC Sans" w:cs="Times New Roman"/>
-                <w:color w:val="000000" w:themeColor="text1"/>
-                <w:sz w:val="18"/>
-                <w:szCs w:val="18"/>
-              </w:rPr>
-              <w:t>actionedDate</w:t>
-            </w:r>
-            <w:proofErr w:type="spellEnd"/>
-            <w:r>
-              <w:rPr>
-                <w:rFonts w:ascii="BC Sans" w:eastAsia="Times New Roman" w:hAnsi="BC Sans" w:cs="Times New Roman"/>
-                <w:color w:val="000000" w:themeColor="text1"/>
-                <w:sz w:val="18"/>
-                <w:szCs w:val="18"/>
-              </w:rPr>
-              <w:t xml:space="preserve">} </w:t>
-            </w:r>
-            <w:r>
-              <w:rPr>
-                <w:rFonts w:ascii="BC Sans" w:eastAsia="Times New Roman" w:hAnsi="BC Sans" w:cs="Times New Roman"/>
-                <w:color w:val="000000" w:themeColor="text1"/>
-                <w:sz w:val="18"/>
-                <w:szCs w:val="18"/>
-              </w:rPr>
-              <w:t xml:space="preserve"> </w:t>
-            </w:r>
-            <w:r>
-              <w:rPr>
-                <w:rFonts w:ascii="BC Sans" w:eastAsia="Times New Roman" w:hAnsi="BC Sans" w:cs="Times New Roman"/>
-                <w:color w:val="000000" w:themeColor="text1"/>
-                <w:sz w:val="18"/>
-                <w:szCs w:val="18"/>
-              </w:rPr>
-              <w:t>{</w:t>
-            </w:r>
-            <w:proofErr w:type="spellStart"/>
-            <w:r>
-              <w:rPr>
-                <w:rFonts w:ascii="BC Sans" w:eastAsia="Times New Roman" w:hAnsi="BC Sans" w:cs="Times New Roman"/>
-                <w:color w:val="000000" w:themeColor="text1"/>
-                <w:sz w:val="18"/>
-                <w:szCs w:val="18"/>
-              </w:rPr>
-              <w:t>d.activityNotes</w:t>
+                <w:rFonts w:ascii="BC Sans" w:hAnsi="BC Sans"/>
+                <w:sz w:val="20"/>
+                <w:szCs w:val="20"/>
+              </w:rPr>
+              <w:t>contentText</w:t>
             </w:r>
             <w:proofErr w:type="spellEnd"/>
             <w:proofErr w:type="gramEnd"/>
             <w:r>
               <w:rPr>
-                <w:rFonts w:ascii="BC Sans" w:eastAsia="Times New Roman" w:hAnsi="BC Sans" w:cs="Times New Roman"/>
-                <w:color w:val="000000" w:themeColor="text1"/>
-                <w:sz w:val="18"/>
-                <w:szCs w:val="18"/>
-              </w:rPr>
-              <w:t>[i+1</w:t>
-            </w:r>
-            <w:proofErr w:type="gramStart"/>
-            <w:r>
-              <w:rPr>
-                <w:rFonts w:ascii="BC Sans" w:eastAsia="Times New Roman" w:hAnsi="BC Sans" w:cs="Times New Roman"/>
-                <w:color w:val="000000" w:themeColor="text1"/>
-                <w:sz w:val="18"/>
-                <w:szCs w:val="18"/>
-              </w:rPr>
-              <w:t>].</w:t>
-            </w:r>
-            <w:proofErr w:type="spellStart"/>
-            <w:r>
-              <w:rPr>
-                <w:rFonts w:ascii="BC Sans" w:eastAsia="Times New Roman" w:hAnsi="BC Sans" w:cs="Times New Roman"/>
-                <w:color w:val="000000" w:themeColor="text1"/>
-                <w:sz w:val="18"/>
-                <w:szCs w:val="18"/>
-              </w:rPr>
-              <w:t>actionedTime</w:t>
-            </w:r>
-            <w:proofErr w:type="spellEnd"/>
-            <w:proofErr w:type="gramEnd"/>
-            <w:r>
-              <w:rPr>
-                <w:rFonts w:ascii="BC Sans" w:eastAsia="Times New Roman" w:hAnsi="BC Sans" w:cs="Times New Roman"/>
-                <w:color w:val="000000" w:themeColor="text1"/>
-                <w:sz w:val="18"/>
-                <w:szCs w:val="18"/>
+                <w:rFonts w:ascii="BC Sans" w:hAnsi="BC Sans"/>
+                <w:sz w:val="20"/>
+                <w:szCs w:val="20"/>
               </w:rPr>
               <w:t>}</w:t>
             </w:r>
@@ -1102,7 +1045,7 @@
         </w:tc>
         <w:tc>
           <w:tcPr>
-            <w:tcW w:w="2070" w:type="dxa"/>
+            <w:tcW w:w="1848" w:type="dxa"/>
             <w:tcBorders>
               <w:left w:val="single" w:sz="4" w:space="0" w:color="7F7F7F" w:themeColor="text1" w:themeTint="80"/>
             </w:tcBorders>

</xml_diff>

<commit_message>
feat: Enforcement actions (#1540)
Co-authored-by: Ryan Rondeau <nayr974@users.noreply.github.com>
Co-authored-by: team-wolverine-nrm-repo-updater[bot] <203337993+team-wolverine-nrm-repo-updater[bot]@users.noreply.github.com>
Co-authored-by: jon-funk <johnthomasfunk@gmail.com>
Co-authored-by: Dmitri <108112696+dk-bcps@users.noreply.github.com>
Co-authored-by: Mike Vesprini <mike@button.is>
Co-authored-by: Mike Vesprini <11034827+mikevespi@users.noreply.github.com>
Co-authored-by: renovate[bot] <29139614+renovate[bot]@users.noreply.github.com>
Co-authored-by: Scarlett <35635257+Scarlett-Truong@users.noreply.github.com>
Co-authored-by: Ryan Rondeau <ryan_rondeau@live.ca>
</commit_message>
<xml_diff>
--- a/backend/templates/continuation-report/CDOGS-CR_TEMPLATE-v1.docx
+++ b/backend/templates/continuation-report/CDOGS-CR_TEMPLATE-v1.docx
@@ -5,12 +5,6 @@
     <w:p>
       <w:pPr>
         <w:spacing w:after="80"/>
-        <w:rPr>
-          <w:b/>
-          <w:bCs/>
-          <w:sz w:val="24"/>
-          <w:szCs w:val="24"/>
-        </w:rPr>
       </w:pPr>
       <w:r>
         <w:rPr>
@@ -55,124 +49,200 @@
     </w:p>
     <w:p>
       <w:pPr>
-        <w:spacing w:after="80"/>
-        <w:rPr>
-          <w:rFonts w:eastAsia="Times New Roman" w:cs="Times New Roman"/>
-          <w:color w:val="000000" w:themeColor="text1"/>
-        </w:rPr>
+        <w:pBdr>
+          <w:bottom w:val="single" w:sz="4" w:space="0" w:color="000000"/>
+        </w:pBdr>
       </w:pPr>
     </w:p>
     <w:p>
       <w:pPr>
-        <w:spacing w:after="80"/>
-        <w:rPr>
-          <w:b/>
-          <w:bCs/>
-          <w:sz w:val="24"/>
-          <w:szCs w:val="24"/>
-        </w:rPr>
+        <w:spacing w:before="60" w:after="240"/>
       </w:pPr>
-      <w:r>
-        <w:rPr>
-          <w:rFonts w:eastAsia="Times New Roman" w:cs="Times New Roman"/>
-          <w:color w:val="000000" w:themeColor="text1"/>
-        </w:rPr>
-        <w:t>Investigation</w:t>
-      </w:r>
-      <w:r>
-        <w:rPr>
-          <w:rFonts w:eastAsia="Times New Roman" w:cs="Times New Roman"/>
-          <w:color w:val="000000" w:themeColor="text1"/>
-        </w:rPr>
-        <w:t>:</w:t>
-      </w:r>
-      <w:r>
-        <w:rPr>
-          <w:rFonts w:eastAsia="Times New Roman" w:cs="Times New Roman"/>
-          <w:color w:val="000000" w:themeColor="text1"/>
-        </w:rPr>
-        <w:t xml:space="preserve"> </w:t>
-      </w:r>
-      <w:r>
-        <w:rPr>
-          <w:rFonts w:eastAsia="Times New Roman" w:cs="Times New Roman"/>
-          <w:color w:val="000000" w:themeColor="text1"/>
-        </w:rPr>
-        <w:t>{</w:t>
-      </w:r>
-      <w:proofErr w:type="gramStart"/>
-      <w:r>
-        <w:rPr>
-          <w:rFonts w:eastAsia="Times New Roman" w:cs="Times New Roman"/>
-          <w:color w:val="000000" w:themeColor="text1"/>
-        </w:rPr>
-        <w:t>d</w:t>
-      </w:r>
-      <w:r>
-        <w:rPr>
-          <w:sz w:val="18"/>
-          <w:szCs w:val="18"/>
-        </w:rPr>
-        <w:t>.</w:t>
-      </w:r>
-      <w:r>
-        <w:rPr>
-          <w:rFonts w:eastAsia="Times New Roman" w:cs="Times New Roman"/>
-          <w:color w:val="000000" w:themeColor="text1"/>
-        </w:rPr>
-        <w:t>investigation.name</w:t>
-      </w:r>
-      <w:proofErr w:type="gramEnd"/>
-      <w:r>
-        <w:rPr>
-          <w:rFonts w:eastAsia="Times New Roman" w:cs="Times New Roman"/>
-          <w:color w:val="000000" w:themeColor="text1"/>
-        </w:rPr>
-        <w:t>}</w:t>
-      </w:r>
     </w:p>
+    <w:tbl>
+      <w:tblPr>
+        <w:tblStyle w:val="PlainTable4"/>
+        <w:tblW w:w="10980" w:type="dxa"/>
+        <w:tblLayout w:type="fixed"/>
+        <w:tblLook w:val="06A0" w:firstRow="1" w:lastRow="0" w:firstColumn="1" w:lastColumn="0" w:noHBand="1" w:noVBand="1"/>
+      </w:tblPr>
+      <w:tblGrid>
+        <w:gridCol w:w="7380"/>
+        <w:gridCol w:w="3600"/>
+      </w:tblGrid>
+      <w:tr>
+        <w:trPr>
+          <w:cnfStyle w:val="100000000000" w:firstRow="1" w:lastRow="0" w:firstColumn="0" w:lastColumn="0" w:oddVBand="0" w:evenVBand="0" w:oddHBand="0" w:evenHBand="0" w:firstRowFirstColumn="0" w:firstRowLastColumn="0" w:lastRowFirstColumn="0" w:lastRowLastColumn="0"/>
+          <w:trHeight w:val="300"/>
+        </w:trPr>
+        <w:tc>
+          <w:tcPr>
+            <w:cnfStyle w:val="001000000000" w:firstRow="0" w:lastRow="0" w:firstColumn="1" w:lastColumn="0" w:oddVBand="0" w:evenVBand="0" w:oddHBand="0" w:evenHBand="0" w:firstRowFirstColumn="0" w:firstRowLastColumn="0" w:lastRowFirstColumn="0" w:lastRowLastColumn="0"/>
+            <w:tcW w:w="7380" w:type="dxa"/>
+          </w:tcPr>
+          <w:p>
+            <w:pPr>
+              <w:rPr>
+                <w:rFonts w:ascii="BC Sans" w:eastAsia="Times New Roman" w:hAnsi="BC Sans" w:cs="Times New Roman"/>
+                <w:b w:val="0"/>
+                <w:bCs w:val="0"/>
+                <w:color w:val="000000" w:themeColor="text1"/>
+                <w:sz w:val="20"/>
+                <w:szCs w:val="20"/>
+              </w:rPr>
+            </w:pPr>
+            <w:proofErr w:type="gramStart"/>
+            <w:r>
+              <w:rPr>
+                <w:rFonts w:ascii="BC Sans" w:eastAsia="Times New Roman" w:hAnsi="BC Sans" w:cs="Times New Roman"/>
+                <w:b w:val="0"/>
+                <w:bCs w:val="0"/>
+                <w:color w:val="000000" w:themeColor="text1"/>
+                <w:sz w:val="20"/>
+                <w:szCs w:val="20"/>
+              </w:rPr>
+              <w:t>Investigation</w:t>
+            </w:r>
+            <w:r>
+              <w:rPr>
+                <w:rFonts w:ascii="BC Sans" w:eastAsia="Times New Roman" w:hAnsi="BC Sans" w:cs="Times New Roman"/>
+                <w:b w:val="0"/>
+                <w:bCs w:val="0"/>
+                <w:color w:val="000000" w:themeColor="text1"/>
+                <w:sz w:val="20"/>
+                <w:szCs w:val="20"/>
+              </w:rPr>
+              <w:t>:</w:t>
+            </w:r>
+            <w:r>
+              <w:rPr>
+                <w:rFonts w:ascii="BC Sans" w:eastAsia="Times New Roman" w:hAnsi="BC Sans" w:cs="Times New Roman"/>
+                <w:b w:val="0"/>
+                <w:bCs w:val="0"/>
+                <w:color w:val="000000" w:themeColor="text1"/>
+                <w:sz w:val="20"/>
+                <w:szCs w:val="20"/>
+              </w:rPr>
+              <w:t xml:space="preserve"> </w:t>
+            </w:r>
+            <w:r>
+              <w:rPr>
+                <w:rFonts w:ascii="BC Sans" w:eastAsia="Times New Roman" w:hAnsi="BC Sans" w:cs="Times New Roman"/>
+                <w:b w:val="0"/>
+                <w:bCs w:val="0"/>
+                <w:color w:val="000000" w:themeColor="text1"/>
+                <w:sz w:val="20"/>
+                <w:szCs w:val="20"/>
+              </w:rPr>
+              <w:t>{</w:t>
+            </w:r>
+            <w:r>
+              <w:rPr>
+                <w:rFonts w:ascii="BC Sans" w:eastAsia="Times New Roman" w:hAnsi="BC Sans" w:cs="Times New Roman"/>
+                <w:b w:val="0"/>
+                <w:bCs w:val="0"/>
+                <w:color w:val="000000" w:themeColor="text1"/>
+                <w:sz w:val="20"/>
+                <w:szCs w:val="20"/>
+              </w:rPr>
+              <w:t>d</w:t>
+            </w:r>
+            <w:r>
+              <w:rPr>
+                <w:rFonts w:ascii="BC Sans" w:eastAsia="BC Sans" w:hAnsi="BC Sans" w:cs="BC Sans"/>
+                <w:sz w:val="18"/>
+                <w:szCs w:val="18"/>
+              </w:rPr>
+              <w:t>.</w:t>
+            </w:r>
+            <w:r>
+              <w:rPr>
+                <w:rFonts w:ascii="BC Sans" w:eastAsia="Times New Roman" w:hAnsi="BC Sans" w:cs="Times New Roman"/>
+                <w:b w:val="0"/>
+                <w:bCs w:val="0"/>
+                <w:color w:val="000000" w:themeColor="text1"/>
+                <w:sz w:val="20"/>
+                <w:szCs w:val="20"/>
+              </w:rPr>
+              <w:t>investigation.name</w:t>
+            </w:r>
+            <w:proofErr w:type="gramEnd"/>
+            <w:r>
+              <w:rPr>
+                <w:rFonts w:ascii="BC Sans" w:eastAsia="Times New Roman" w:hAnsi="BC Sans" w:cs="Times New Roman"/>
+                <w:b w:val="0"/>
+                <w:bCs w:val="0"/>
+                <w:color w:val="000000" w:themeColor="text1"/>
+                <w:sz w:val="20"/>
+                <w:szCs w:val="20"/>
+              </w:rPr>
+              <w:t>}</w:t>
+            </w:r>
+          </w:p>
+        </w:tc>
+        <w:tc>
+          <w:tcPr>
+            <w:tcW w:w="3600" w:type="dxa"/>
+          </w:tcPr>
+          <w:p>
+            <w:pPr>
+              <w:cnfStyle w:val="100000000000" w:firstRow="1" w:lastRow="0" w:firstColumn="0" w:lastColumn="0" w:oddVBand="0" w:evenVBand="0" w:oddHBand="0" w:evenHBand="0" w:firstRowFirstColumn="0" w:firstRowLastColumn="0" w:lastRowFirstColumn="0" w:lastRowLastColumn="0"/>
+            </w:pPr>
+            <w:proofErr w:type="gramStart"/>
+            <w:r>
+              <w:rPr>
+                <w:rFonts w:ascii="BC Sans" w:eastAsia="Times New Roman" w:hAnsi="BC Sans" w:cs="Times New Roman"/>
+                <w:b w:val="0"/>
+                <w:bCs w:val="0"/>
+                <w:color w:val="000000" w:themeColor="text1"/>
+                <w:sz w:val="20"/>
+                <w:szCs w:val="20"/>
+              </w:rPr>
+              <w:t>Description: {</w:t>
+            </w:r>
+            <w:proofErr w:type="spellStart"/>
+            <w:r>
+              <w:rPr>
+                <w:rFonts w:ascii="BC Sans" w:eastAsia="Times New Roman" w:hAnsi="BC Sans" w:cs="Times New Roman"/>
+                <w:b w:val="0"/>
+                <w:bCs w:val="0"/>
+                <w:color w:val="000000" w:themeColor="text1"/>
+                <w:sz w:val="20"/>
+                <w:szCs w:val="20"/>
+              </w:rPr>
+              <w:t>d.investigation</w:t>
+            </w:r>
+            <w:proofErr w:type="gramEnd"/>
+            <w:r>
+              <w:rPr>
+                <w:rFonts w:ascii="BC Sans" w:eastAsia="Times New Roman" w:hAnsi="BC Sans" w:cs="Times New Roman"/>
+                <w:b w:val="0"/>
+                <w:bCs w:val="0"/>
+                <w:color w:val="000000" w:themeColor="text1"/>
+                <w:sz w:val="20"/>
+                <w:szCs w:val="20"/>
+              </w:rPr>
+              <w:t>.description</w:t>
+            </w:r>
+            <w:proofErr w:type="spellEnd"/>
+            <w:r>
+              <w:rPr>
+                <w:rFonts w:ascii="BC Sans" w:eastAsia="Times New Roman" w:hAnsi="BC Sans" w:cs="Times New Roman"/>
+                <w:b w:val="0"/>
+                <w:bCs w:val="0"/>
+                <w:color w:val="000000" w:themeColor="text1"/>
+                <w:sz w:val="20"/>
+                <w:szCs w:val="20"/>
+              </w:rPr>
+              <w:t>}</w:t>
+            </w:r>
+          </w:p>
+        </w:tc>
+      </w:tr>
+    </w:tbl>
     <w:p>
       <w:pPr>
-        <w:spacing w:after="80"/>
-      </w:pPr>
-      <w:r>
-        <w:rPr>
-          <w:rFonts w:eastAsia="Times New Roman" w:cs="Times New Roman"/>
-          <w:color w:val="000000" w:themeColor="text1"/>
-        </w:rPr>
-        <w:t>Description: {</w:t>
-      </w:r>
-      <w:proofErr w:type="spellStart"/>
-      <w:proofErr w:type="gramStart"/>
-      <w:r>
-        <w:rPr>
-          <w:rFonts w:eastAsia="Times New Roman" w:cs="Times New Roman"/>
-          <w:color w:val="000000" w:themeColor="text1"/>
-        </w:rPr>
-        <w:t>d.investigation</w:t>
-      </w:r>
-      <w:proofErr w:type="gramEnd"/>
-      <w:r>
-        <w:rPr>
-          <w:rFonts w:eastAsia="Times New Roman" w:cs="Times New Roman"/>
-          <w:color w:val="000000" w:themeColor="text1"/>
-        </w:rPr>
-        <w:t>.description</w:t>
-      </w:r>
-      <w:proofErr w:type="spellEnd"/>
-      <w:r>
-        <w:rPr>
-          <w:rFonts w:eastAsia="Times New Roman" w:cs="Times New Roman"/>
-          <w:color w:val="000000" w:themeColor="text1"/>
-        </w:rPr>
-        <w:t>}</w:t>
-      </w:r>
-    </w:p>
-    <w:p>
-      <w:pPr>
-        <w:pBdr>
-          <w:bottom w:val="single" w:sz="4" w:space="0" w:color="000000"/>
-        </w:pBdr>
+        <w:spacing w:before="60" w:after="240"/>
       </w:pPr>
     </w:p>
     <w:p>
@@ -187,9 +257,9 @@
         <w:tblLook w:val="04A0" w:firstRow="1" w:lastRow="0" w:firstColumn="1" w:lastColumn="0" w:noHBand="0" w:noVBand="1"/>
       </w:tblPr>
       <w:tblGrid>
-        <w:gridCol w:w="3124"/>
-        <w:gridCol w:w="5797"/>
-        <w:gridCol w:w="1879"/>
+        <w:gridCol w:w="6493"/>
+        <w:gridCol w:w="2586"/>
+        <w:gridCol w:w="1721"/>
       </w:tblGrid>
       <w:tr>
         <w:trPr>
@@ -199,7 +269,7 @@
         <w:tc>
           <w:tcPr>
             <w:cnfStyle w:val="001000000100" w:firstRow="0" w:lastRow="0" w:firstColumn="1" w:lastColumn="0" w:oddVBand="0" w:evenVBand="0" w:oddHBand="0" w:evenHBand="0" w:firstRowFirstColumn="1" w:firstRowLastColumn="0" w:lastRowFirstColumn="0" w:lastRowLastColumn="0"/>
-            <w:tcW w:w="2835" w:type="dxa"/>
+            <w:tcW w:w="7549" w:type="dxa"/>
           </w:tcPr>
           <w:p>
             <w:pPr>
@@ -223,13 +293,13 @@
                 <w:szCs w:val="20"/>
                 <w14:ligatures w14:val="none"/>
               </w:rPr>
-              <w:t>Date/time actioned</w:t>
+              <w:t>Continuation Report</w:t>
             </w:r>
           </w:p>
         </w:tc>
         <w:tc>
           <w:tcPr>
-            <w:tcW w:w="6117" w:type="dxa"/>
+            <w:tcW w:w="1181" w:type="dxa"/>
           </w:tcPr>
           <w:p>
             <w:pPr>
@@ -254,13 +324,13 @@
                 <w:szCs w:val="20"/>
                 <w14:ligatures w14:val="none"/>
               </w:rPr>
-              <w:t>Continuation Report</w:t>
+              <w:t>Date/time actioned</w:t>
             </w:r>
           </w:p>
         </w:tc>
         <w:tc>
           <w:tcPr>
-            <w:tcW w:w="1848" w:type="dxa"/>
+            <w:tcW w:w="2070" w:type="dxa"/>
           </w:tcPr>
           <w:p>
             <w:pPr>
@@ -298,7 +368,7 @@
         <w:tc>
           <w:tcPr>
             <w:cnfStyle w:val="001000000000" w:firstRow="0" w:lastRow="0" w:firstColumn="1" w:lastColumn="0" w:oddVBand="0" w:evenVBand="0" w:oddHBand="0" w:evenHBand="0" w:firstRowFirstColumn="0" w:firstRowLastColumn="0" w:lastRowFirstColumn="0" w:lastRowLastColumn="0"/>
-            <w:tcW w:w="2835" w:type="dxa"/>
+            <w:tcW w:w="7549" w:type="dxa"/>
             <w:noWrap/>
             <w:vAlign w:val="center"/>
           </w:tcPr>
@@ -326,6 +396,7 @@
               <w:t>{</w:t>
             </w:r>
             <w:proofErr w:type="spellStart"/>
+            <w:proofErr w:type="gramStart"/>
             <w:r>
               <w:rPr>
                 <w:rFonts w:ascii="BC Sans" w:hAnsi="BC Sans"/>
@@ -338,6 +409,7 @@
               <w:t>d.activityNotes</w:t>
             </w:r>
             <w:proofErr w:type="spellEnd"/>
+            <w:proofErr w:type="gramEnd"/>
             <w:r>
               <w:rPr>
                 <w:rFonts w:ascii="BC Sans" w:hAnsi="BC Sans"/>
@@ -362,6 +434,7 @@
               <w:t>i</w:t>
             </w:r>
             <w:proofErr w:type="spellEnd"/>
+            <w:proofErr w:type="gramStart"/>
             <w:r>
               <w:rPr>
                 <w:rFonts w:ascii="BC Sans" w:hAnsi="BC Sans"/>
@@ -383,9 +456,10 @@
                 <w:sz w:val="20"/>
                 <w:szCs w:val="20"/>
               </w:rPr>
-              <w:t>actionedDate</w:t>
+              <w:t>contentText</w:t>
             </w:r>
             <w:proofErr w:type="spellEnd"/>
+            <w:proofErr w:type="gramEnd"/>
             <w:r>
               <w:rPr>
                 <w:rFonts w:ascii="BC Sans" w:hAnsi="BC Sans"/>
@@ -395,107 +469,13 @@
                 <w:sz w:val="20"/>
                 <w:szCs w:val="20"/>
               </w:rPr>
-              <w:t xml:space="preserve">}  </w:t>
-            </w:r>
-            <w:r>
-              <w:rPr>
-                <w:rFonts w:ascii="BC Sans" w:hAnsi="BC Sans"/>
-                <w:b w:val="0"/>
-                <w:bCs w:val="0"/>
-                <w:caps w:val="0"/>
-                <w:sz w:val="20"/>
-                <w:szCs w:val="20"/>
-              </w:rPr>
-              <w:t xml:space="preserve"> </w:t>
-            </w:r>
-            <w:r>
-              <w:rPr>
-                <w:rFonts w:ascii="BC Sans" w:hAnsi="BC Sans"/>
-                <w:b w:val="0"/>
-                <w:bCs w:val="0"/>
-                <w:caps w:val="0"/>
-                <w:sz w:val="20"/>
-                <w:szCs w:val="20"/>
-              </w:rPr>
-              <w:t>{</w:t>
-            </w:r>
-            <w:proofErr w:type="spellStart"/>
-            <w:r>
-              <w:rPr>
-                <w:rFonts w:ascii="BC Sans" w:hAnsi="BC Sans"/>
-                <w:b w:val="0"/>
-                <w:bCs w:val="0"/>
-                <w:caps w:val="0"/>
-                <w:sz w:val="20"/>
-                <w:szCs w:val="20"/>
-              </w:rPr>
-              <w:t>d.activityNotes</w:t>
-            </w:r>
-            <w:proofErr w:type="spellEnd"/>
-            <w:r>
-              <w:rPr>
-                <w:rFonts w:ascii="BC Sans" w:hAnsi="BC Sans"/>
-                <w:b w:val="0"/>
-                <w:bCs w:val="0"/>
-                <w:caps w:val="0"/>
-                <w:sz w:val="20"/>
-                <w:szCs w:val="20"/>
-              </w:rPr>
-              <w:t>[</w:t>
-            </w:r>
-            <w:proofErr w:type="spellStart"/>
-            <w:r>
-              <w:rPr>
-                <w:rFonts w:ascii="BC Sans" w:hAnsi="BC Sans"/>
-                <w:b w:val="0"/>
-                <w:bCs w:val="0"/>
-                <w:caps w:val="0"/>
-                <w:sz w:val="20"/>
-                <w:szCs w:val="20"/>
-              </w:rPr>
-              <w:t>i</w:t>
-            </w:r>
-            <w:proofErr w:type="spellEnd"/>
-            <w:r>
-              <w:rPr>
-                <w:rFonts w:ascii="BC Sans" w:hAnsi="BC Sans"/>
-                <w:b w:val="0"/>
-                <w:bCs w:val="0"/>
-                <w:caps w:val="0"/>
-                <w:sz w:val="20"/>
-                <w:szCs w:val="20"/>
-              </w:rPr>
-              <w:t>].</w:t>
-            </w:r>
-            <w:proofErr w:type="spellStart"/>
-            <w:r>
-              <w:rPr>
-                <w:rFonts w:ascii="BC Sans" w:hAnsi="BC Sans"/>
-                <w:b w:val="0"/>
-                <w:bCs w:val="0"/>
-                <w:caps w:val="0"/>
-                <w:sz w:val="20"/>
-                <w:szCs w:val="20"/>
-              </w:rPr>
-              <w:t>actionedTime</w:t>
-            </w:r>
-            <w:proofErr w:type="spellEnd"/>
-            <w:r>
-              <w:rPr>
-                <w:rFonts w:ascii="BC Sans" w:hAnsi="BC Sans"/>
-                <w:b w:val="0"/>
-                <w:bCs w:val="0"/>
-                <w:caps w:val="0"/>
-                <w:sz w:val="20"/>
-                <w:szCs w:val="20"/>
-              </w:rPr>
               <w:t>}</w:t>
             </w:r>
           </w:p>
         </w:tc>
         <w:tc>
           <w:tcPr>
-            <w:tcW w:w="6117" w:type="dxa"/>
+            <w:tcW w:w="1181" w:type="dxa"/>
             <w:tcBorders>
               <w:right w:val="single" w:sz="4" w:space="0" w:color="7F7F7F" w:themeColor="text1" w:themeTint="80"/>
             </w:tcBorders>
@@ -515,9 +495,10 @@
             </w:pPr>
             <w:r>
               <w:rPr>
-                <w:rFonts w:ascii="BC Sans" w:hAnsi="BC Sans"/>
-                <w:sz w:val="20"/>
-                <w:szCs w:val="20"/>
+                <w:rFonts w:ascii="BC Sans" w:eastAsia="Times New Roman" w:hAnsi="BC Sans" w:cs="Times New Roman"/>
+                <w:color w:val="000000" w:themeColor="text1"/>
+                <w:sz w:val="18"/>
+                <w:szCs w:val="18"/>
               </w:rPr>
               <w:t>{</w:t>
             </w:r>
@@ -525,9 +506,10 @@
             <w:proofErr w:type="gramStart"/>
             <w:r>
               <w:rPr>
-                <w:rFonts w:ascii="BC Sans" w:hAnsi="BC Sans"/>
-                <w:sz w:val="20"/>
-                <w:szCs w:val="20"/>
+                <w:rFonts w:ascii="BC Sans" w:eastAsia="Times New Roman" w:hAnsi="BC Sans" w:cs="Times New Roman"/>
+                <w:color w:val="000000" w:themeColor="text1"/>
+                <w:sz w:val="18"/>
+                <w:szCs w:val="18"/>
               </w:rPr>
               <w:t>d.activityNotes</w:t>
             </w:r>
@@ -535,18 +517,20 @@
             <w:proofErr w:type="gramEnd"/>
             <w:r>
               <w:rPr>
-                <w:rFonts w:ascii="BC Sans" w:hAnsi="BC Sans"/>
-                <w:sz w:val="20"/>
-                <w:szCs w:val="20"/>
+                <w:rFonts w:ascii="BC Sans" w:eastAsia="Times New Roman" w:hAnsi="BC Sans" w:cs="Times New Roman"/>
+                <w:color w:val="000000" w:themeColor="text1"/>
+                <w:sz w:val="18"/>
+                <w:szCs w:val="18"/>
               </w:rPr>
               <w:t>[</w:t>
             </w:r>
             <w:proofErr w:type="spellStart"/>
             <w:r>
               <w:rPr>
-                <w:rFonts w:ascii="BC Sans" w:hAnsi="BC Sans"/>
-                <w:sz w:val="20"/>
-                <w:szCs w:val="20"/>
+                <w:rFonts w:ascii="BC Sans" w:eastAsia="Times New Roman" w:hAnsi="BC Sans" w:cs="Times New Roman"/>
+                <w:color w:val="000000" w:themeColor="text1"/>
+                <w:sz w:val="18"/>
+                <w:szCs w:val="18"/>
               </w:rPr>
               <w:t>i</w:t>
             </w:r>
@@ -554,28 +538,111 @@
             <w:proofErr w:type="gramStart"/>
             <w:r>
               <w:rPr>
-                <w:rFonts w:ascii="BC Sans" w:hAnsi="BC Sans"/>
-                <w:sz w:val="20"/>
-                <w:szCs w:val="20"/>
+                <w:rFonts w:ascii="BC Sans" w:eastAsia="Times New Roman" w:hAnsi="BC Sans" w:cs="Times New Roman"/>
+                <w:color w:val="000000" w:themeColor="text1"/>
+                <w:sz w:val="18"/>
+                <w:szCs w:val="18"/>
               </w:rPr>
               <w:t>].</w:t>
             </w:r>
             <w:proofErr w:type="spellStart"/>
             <w:r>
               <w:rPr>
-                <w:rFonts w:ascii="BC Sans" w:hAnsi="BC Sans"/>
-                <w:sz w:val="20"/>
-                <w:szCs w:val="20"/>
-              </w:rPr>
-              <w:t>contentText</w:t>
+                <w:rFonts w:ascii="BC Sans" w:eastAsia="Times New Roman" w:hAnsi="BC Sans" w:cs="Times New Roman"/>
+                <w:color w:val="000000" w:themeColor="text1"/>
+                <w:sz w:val="18"/>
+                <w:szCs w:val="18"/>
+              </w:rPr>
+              <w:t>actionedDate</w:t>
+            </w:r>
+            <w:proofErr w:type="spellEnd"/>
+            <w:r>
+              <w:rPr>
+                <w:rFonts w:ascii="BC Sans" w:eastAsia="Times New Roman" w:hAnsi="BC Sans" w:cs="Times New Roman"/>
+                <w:color w:val="000000" w:themeColor="text1"/>
+                <w:sz w:val="18"/>
+                <w:szCs w:val="18"/>
+              </w:rPr>
+              <w:t xml:space="preserve">} </w:t>
+            </w:r>
+            <w:r>
+              <w:rPr>
+                <w:rFonts w:ascii="BC Sans" w:eastAsia="Times New Roman" w:hAnsi="BC Sans" w:cs="Times New Roman"/>
+                <w:color w:val="000000" w:themeColor="text1"/>
+                <w:sz w:val="18"/>
+                <w:szCs w:val="18"/>
+              </w:rPr>
+              <w:t xml:space="preserve"> </w:t>
+            </w:r>
+            <w:r>
+              <w:rPr>
+                <w:rFonts w:ascii="BC Sans" w:eastAsia="Times New Roman" w:hAnsi="BC Sans" w:cs="Times New Roman"/>
+                <w:color w:val="000000" w:themeColor="text1"/>
+                <w:sz w:val="18"/>
+                <w:szCs w:val="18"/>
+              </w:rPr>
+              <w:t>{</w:t>
+            </w:r>
+            <w:proofErr w:type="spellStart"/>
+            <w:r>
+              <w:rPr>
+                <w:rFonts w:ascii="BC Sans" w:eastAsia="Times New Roman" w:hAnsi="BC Sans" w:cs="Times New Roman"/>
+                <w:color w:val="000000" w:themeColor="text1"/>
+                <w:sz w:val="18"/>
+                <w:szCs w:val="18"/>
+              </w:rPr>
+              <w:t>d.activityNotes</w:t>
             </w:r>
             <w:proofErr w:type="spellEnd"/>
             <w:proofErr w:type="gramEnd"/>
             <w:r>
               <w:rPr>
-                <w:rFonts w:ascii="BC Sans" w:hAnsi="BC Sans"/>
-                <w:sz w:val="20"/>
-                <w:szCs w:val="20"/>
+                <w:rFonts w:ascii="BC Sans" w:eastAsia="Times New Roman" w:hAnsi="BC Sans" w:cs="Times New Roman"/>
+                <w:color w:val="000000" w:themeColor="text1"/>
+                <w:sz w:val="18"/>
+                <w:szCs w:val="18"/>
+              </w:rPr>
+              <w:t>[</w:t>
+            </w:r>
+            <w:proofErr w:type="spellStart"/>
+            <w:r>
+              <w:rPr>
+                <w:rFonts w:ascii="BC Sans" w:eastAsia="Times New Roman" w:hAnsi="BC Sans" w:cs="Times New Roman"/>
+                <w:color w:val="000000" w:themeColor="text1"/>
+                <w:sz w:val="18"/>
+                <w:szCs w:val="18"/>
+              </w:rPr>
+              <w:t>i</w:t>
+            </w:r>
+            <w:proofErr w:type="spellEnd"/>
+            <w:proofErr w:type="gramStart"/>
+            <w:r>
+              <w:rPr>
+                <w:rFonts w:ascii="BC Sans" w:eastAsia="Times New Roman" w:hAnsi="BC Sans" w:cs="Times New Roman"/>
+                <w:color w:val="000000" w:themeColor="text1"/>
+                <w:sz w:val="18"/>
+                <w:szCs w:val="18"/>
+              </w:rPr>
+              <w:t>].</w:t>
+            </w:r>
+            <w:proofErr w:type="spellStart"/>
+            <w:r>
+              <w:rPr>
+                <w:rFonts w:ascii="BC Sans" w:eastAsia="Times New Roman" w:hAnsi="BC Sans" w:cs="Times New Roman"/>
+                <w:color w:val="000000" w:themeColor="text1"/>
+                <w:sz w:val="18"/>
+                <w:szCs w:val="18"/>
+              </w:rPr>
+              <w:t>actionedTime</w:t>
+            </w:r>
+            <w:proofErr w:type="spellEnd"/>
+            <w:proofErr w:type="gramEnd"/>
+            <w:r>
+              <w:rPr>
+                <w:rFonts w:ascii="BC Sans" w:eastAsia="Times New Roman" w:hAnsi="BC Sans" w:cs="Times New Roman"/>
+                <w:color w:val="000000" w:themeColor="text1"/>
+                <w:sz w:val="18"/>
+                <w:szCs w:val="18"/>
               </w:rPr>
               <w:t>}</w:t>
             </w:r>
@@ -583,7 +650,7 @@
         </w:tc>
         <w:tc>
           <w:tcPr>
-            <w:tcW w:w="1848" w:type="dxa"/>
+            <w:tcW w:w="2070" w:type="dxa"/>
             <w:tcBorders>
               <w:left w:val="single" w:sz="4" w:space="0" w:color="7F7F7F" w:themeColor="text1" w:themeTint="80"/>
             </w:tcBorders>
@@ -790,7 +857,7 @@
         <w:tc>
           <w:tcPr>
             <w:cnfStyle w:val="001000000000" w:firstRow="0" w:lastRow="0" w:firstColumn="1" w:lastColumn="0" w:oddVBand="0" w:evenVBand="0" w:oddHBand="0" w:evenHBand="0" w:firstRowFirstColumn="0" w:firstRowLastColumn="0" w:lastRowFirstColumn="0" w:lastRowLastColumn="0"/>
-            <w:tcW w:w="2835" w:type="dxa"/>
+            <w:tcW w:w="7549" w:type="dxa"/>
             <w:noWrap/>
             <w:vAlign w:val="center"/>
           </w:tcPr>
@@ -864,9 +931,10 @@
                 <w:sz w:val="20"/>
                 <w:szCs w:val="20"/>
               </w:rPr>
-              <w:t>actionedDate</w:t>
+              <w:t>contentText</w:t>
             </w:r>
             <w:proofErr w:type="spellEnd"/>
+            <w:proofErr w:type="gramEnd"/>
             <w:r>
               <w:rPr>
                 <w:rFonts w:ascii="BC Sans" w:hAnsi="BC Sans"/>
@@ -878,97 +946,11 @@
               </w:rPr>
               <w:t>}</w:t>
             </w:r>
-            <w:proofErr w:type="gramEnd"/>
-            <w:r>
-              <w:rPr>
-                <w:rFonts w:ascii="BC Sans" w:hAnsi="BC Sans"/>
-                <w:b w:val="0"/>
-                <w:bCs w:val="0"/>
-                <w:caps w:val="0"/>
-                <w:sz w:val="20"/>
-                <w:szCs w:val="20"/>
-              </w:rPr>
-              <w:t xml:space="preserve"> </w:t>
-            </w:r>
-            <w:proofErr w:type="gramStart"/>
-            <w:r>
-              <w:rPr>
-                <w:rFonts w:ascii="BC Sans" w:hAnsi="BC Sans"/>
-                <w:b w:val="0"/>
-                <w:bCs w:val="0"/>
-                <w:caps w:val="0"/>
-                <w:sz w:val="20"/>
-                <w:szCs w:val="20"/>
-              </w:rPr>
-              <w:t xml:space="preserve">  {</w:t>
-            </w:r>
-            <w:proofErr w:type="spellStart"/>
-            <w:r>
-              <w:rPr>
-                <w:rFonts w:ascii="BC Sans" w:hAnsi="BC Sans"/>
-                <w:b w:val="0"/>
-                <w:bCs w:val="0"/>
-                <w:caps w:val="0"/>
-                <w:sz w:val="20"/>
-                <w:szCs w:val="20"/>
-              </w:rPr>
-              <w:t>d.activityNotes</w:t>
-            </w:r>
-            <w:proofErr w:type="spellEnd"/>
-            <w:proofErr w:type="gramEnd"/>
-            <w:r>
-              <w:rPr>
-                <w:rFonts w:ascii="BC Sans" w:hAnsi="BC Sans"/>
-                <w:b w:val="0"/>
-                <w:bCs w:val="0"/>
-                <w:caps w:val="0"/>
-                <w:sz w:val="20"/>
-                <w:szCs w:val="20"/>
-              </w:rPr>
-              <w:t>[i+1</w:t>
-            </w:r>
-            <w:proofErr w:type="gramStart"/>
-            <w:r>
-              <w:rPr>
-                <w:rFonts w:ascii="BC Sans" w:hAnsi="BC Sans"/>
-                <w:b w:val="0"/>
-                <w:bCs w:val="0"/>
-                <w:caps w:val="0"/>
-                <w:sz w:val="20"/>
-                <w:szCs w:val="20"/>
-              </w:rPr>
-              <w:t>].</w:t>
-            </w:r>
-            <w:proofErr w:type="spellStart"/>
-            <w:r>
-              <w:rPr>
-                <w:rFonts w:ascii="BC Sans" w:hAnsi="BC Sans"/>
-                <w:b w:val="0"/>
-                <w:bCs w:val="0"/>
-                <w:caps w:val="0"/>
-                <w:sz w:val="20"/>
-                <w:szCs w:val="20"/>
-              </w:rPr>
-              <w:t>actionedTime</w:t>
-            </w:r>
-            <w:proofErr w:type="spellEnd"/>
-            <w:proofErr w:type="gramEnd"/>
-            <w:r>
-              <w:rPr>
-                <w:rFonts w:ascii="BC Sans" w:hAnsi="BC Sans"/>
-                <w:b w:val="0"/>
-                <w:bCs w:val="0"/>
-                <w:caps w:val="0"/>
-                <w:sz w:val="20"/>
-                <w:szCs w:val="20"/>
-              </w:rPr>
-              <w:t>}</w:t>
-            </w:r>
           </w:p>
         </w:tc>
         <w:tc>
           <w:tcPr>
-            <w:tcW w:w="6117" w:type="dxa"/>
+            <w:tcW w:w="1181" w:type="dxa"/>
             <w:tcBorders>
               <w:right w:val="single" w:sz="4" w:space="0" w:color="7F7F7F" w:themeColor="text1" w:themeTint="80"/>
             </w:tcBorders>
@@ -987,9 +969,10 @@
             </w:pPr>
             <w:r>
               <w:rPr>
-                <w:rFonts w:ascii="BC Sans" w:hAnsi="BC Sans"/>
-                <w:sz w:val="20"/>
-                <w:szCs w:val="20"/>
+                <w:rFonts w:ascii="BC Sans" w:eastAsia="Times New Roman" w:hAnsi="BC Sans" w:cs="Times New Roman"/>
+                <w:color w:val="000000" w:themeColor="text1"/>
+                <w:sz w:val="18"/>
+                <w:szCs w:val="18"/>
               </w:rPr>
               <w:t>{</w:t>
             </w:r>
@@ -997,9 +980,10 @@
             <w:proofErr w:type="gramStart"/>
             <w:r>
               <w:rPr>
-                <w:rFonts w:ascii="BC Sans" w:hAnsi="BC Sans"/>
-                <w:sz w:val="20"/>
-                <w:szCs w:val="20"/>
+                <w:rFonts w:ascii="BC Sans" w:eastAsia="Times New Roman" w:hAnsi="BC Sans" w:cs="Times New Roman"/>
+                <w:color w:val="000000" w:themeColor="text1"/>
+                <w:sz w:val="18"/>
+                <w:szCs w:val="18"/>
               </w:rPr>
               <w:t>d.activityNotes</w:t>
             </w:r>
@@ -1007,37 +991,110 @@
             <w:proofErr w:type="gramEnd"/>
             <w:r>
               <w:rPr>
-                <w:rFonts w:ascii="BC Sans" w:hAnsi="BC Sans"/>
-                <w:sz w:val="20"/>
-                <w:szCs w:val="20"/>
+                <w:rFonts w:ascii="BC Sans" w:eastAsia="Times New Roman" w:hAnsi="BC Sans" w:cs="Times New Roman"/>
+                <w:color w:val="000000" w:themeColor="text1"/>
+                <w:sz w:val="18"/>
+                <w:szCs w:val="18"/>
               </w:rPr>
               <w:t>[i+1</w:t>
             </w:r>
             <w:proofErr w:type="gramStart"/>
             <w:r>
               <w:rPr>
-                <w:rFonts w:ascii="BC Sans" w:hAnsi="BC Sans"/>
-                <w:sz w:val="20"/>
-                <w:szCs w:val="20"/>
+                <w:rFonts w:ascii="BC Sans" w:eastAsia="Times New Roman" w:hAnsi="BC Sans" w:cs="Times New Roman"/>
+                <w:color w:val="000000" w:themeColor="text1"/>
+                <w:sz w:val="18"/>
+                <w:szCs w:val="18"/>
               </w:rPr>
               <w:t>].</w:t>
             </w:r>
             <w:proofErr w:type="spellStart"/>
             <w:r>
               <w:rPr>
-                <w:rFonts w:ascii="BC Sans" w:hAnsi="BC Sans"/>
-                <w:sz w:val="20"/>
-                <w:szCs w:val="20"/>
-              </w:rPr>
-              <w:t>contentText</w:t>
+                <w:rFonts w:ascii="BC Sans" w:eastAsia="Times New Roman" w:hAnsi="BC Sans" w:cs="Times New Roman"/>
+                <w:color w:val="000000" w:themeColor="text1"/>
+                <w:sz w:val="18"/>
+                <w:szCs w:val="18"/>
+              </w:rPr>
+              <w:t>actionedDate</w:t>
+            </w:r>
+            <w:proofErr w:type="spellEnd"/>
+            <w:r>
+              <w:rPr>
+                <w:rFonts w:ascii="BC Sans" w:eastAsia="Times New Roman" w:hAnsi="BC Sans" w:cs="Times New Roman"/>
+                <w:color w:val="000000" w:themeColor="text1"/>
+                <w:sz w:val="18"/>
+                <w:szCs w:val="18"/>
+              </w:rPr>
+              <w:t xml:space="preserve">} </w:t>
+            </w:r>
+            <w:r>
+              <w:rPr>
+                <w:rFonts w:ascii="BC Sans" w:eastAsia="Times New Roman" w:hAnsi="BC Sans" w:cs="Times New Roman"/>
+                <w:color w:val="000000" w:themeColor="text1"/>
+                <w:sz w:val="18"/>
+                <w:szCs w:val="18"/>
+              </w:rPr>
+              <w:t xml:space="preserve"> </w:t>
+            </w:r>
+            <w:r>
+              <w:rPr>
+                <w:rFonts w:ascii="BC Sans" w:eastAsia="Times New Roman" w:hAnsi="BC Sans" w:cs="Times New Roman"/>
+                <w:color w:val="000000" w:themeColor="text1"/>
+                <w:sz w:val="18"/>
+                <w:szCs w:val="18"/>
+              </w:rPr>
+              <w:t>{</w:t>
+            </w:r>
+            <w:proofErr w:type="spellStart"/>
+            <w:r>
+              <w:rPr>
+                <w:rFonts w:ascii="BC Sans" w:eastAsia="Times New Roman" w:hAnsi="BC Sans" w:cs="Times New Roman"/>
+                <w:color w:val="000000" w:themeColor="text1"/>
+                <w:sz w:val="18"/>
+                <w:szCs w:val="18"/>
+              </w:rPr>
+              <w:t>d.activityNotes</w:t>
             </w:r>
             <w:proofErr w:type="spellEnd"/>
             <w:proofErr w:type="gramEnd"/>
             <w:r>
               <w:rPr>
-                <w:rFonts w:ascii="BC Sans" w:hAnsi="BC Sans"/>
-                <w:sz w:val="20"/>
-                <w:szCs w:val="20"/>
+                <w:rFonts w:ascii="BC Sans" w:eastAsia="Times New Roman" w:hAnsi="BC Sans" w:cs="Times New Roman"/>
+                <w:color w:val="000000" w:themeColor="text1"/>
+                <w:sz w:val="18"/>
+                <w:szCs w:val="18"/>
+              </w:rPr>
+              <w:t>[i+1</w:t>
+            </w:r>
+            <w:proofErr w:type="gramStart"/>
+            <w:r>
+              <w:rPr>
+                <w:rFonts w:ascii="BC Sans" w:eastAsia="Times New Roman" w:hAnsi="BC Sans" w:cs="Times New Roman"/>
+                <w:color w:val="000000" w:themeColor="text1"/>
+                <w:sz w:val="18"/>
+                <w:szCs w:val="18"/>
+              </w:rPr>
+              <w:t>].</w:t>
+            </w:r>
+            <w:proofErr w:type="spellStart"/>
+            <w:r>
+              <w:rPr>
+                <w:rFonts w:ascii="BC Sans" w:eastAsia="Times New Roman" w:hAnsi="BC Sans" w:cs="Times New Roman"/>
+                <w:color w:val="000000" w:themeColor="text1"/>
+                <w:sz w:val="18"/>
+                <w:szCs w:val="18"/>
+              </w:rPr>
+              <w:t>actionedTime</w:t>
+            </w:r>
+            <w:proofErr w:type="spellEnd"/>
+            <w:proofErr w:type="gramEnd"/>
+            <w:r>
+              <w:rPr>
+                <w:rFonts w:ascii="BC Sans" w:eastAsia="Times New Roman" w:hAnsi="BC Sans" w:cs="Times New Roman"/>
+                <w:color w:val="000000" w:themeColor="text1"/>
+                <w:sz w:val="18"/>
+                <w:szCs w:val="18"/>
               </w:rPr>
               <w:t>}</w:t>
             </w:r>
@@ -1045,7 +1102,7 @@
         </w:tc>
         <w:tc>
           <w:tcPr>
-            <w:tcW w:w="1848" w:type="dxa"/>
+            <w:tcW w:w="2070" w:type="dxa"/>
             <w:tcBorders>
               <w:left w:val="single" w:sz="4" w:space="0" w:color="7F7F7F" w:themeColor="text1" w:themeTint="80"/>
             </w:tcBorders>

</xml_diff>

<commit_message>
feat: Release Brainrot (#1548)
Co-authored-by: Scarlett <35635257+Scarlett-Truong@users.noreply.github.com>
Co-authored-by: team-wolverine-nrm-repo-updater[bot] <203337993+team-wolverine-nrm-repo-updater[bot]@users.noreply.github.com>
Co-authored-by: Ryan Rondeau <nayr974@users.noreply.github.com>
Co-authored-by: Mike Vesprini <11034827+mikevespi@users.noreply.github.com>
Co-authored-by: jon-funk <johnthomasfunk@gmail.com>
Co-authored-by: Dmitri <108112696+dk-bcps@users.noreply.github.com>
Co-authored-by: Mike Vesprini <mike@button.is>
Co-authored-by: renovate[bot] <29139614+renovate[bot]@users.noreply.github.com>
Co-authored-by: Ryan Rondeau <ryan_rondeau@live.ca>
</commit_message>
<xml_diff>
--- a/backend/templates/continuation-report/CDOGS-CR_TEMPLATE-v1.docx
+++ b/backend/templates/continuation-report/CDOGS-CR_TEMPLATE-v1.docx
@@ -5,12 +5,6 @@
     <w:p>
       <w:pPr>
         <w:spacing w:after="80"/>
-        <w:rPr>
-          <w:b/>
-          <w:bCs/>
-          <w:sz w:val="24"/>
-          <w:szCs w:val="24"/>
-        </w:rPr>
       </w:pPr>
       <w:r>
         <w:rPr>
@@ -55,124 +49,200 @@
     </w:p>
     <w:p>
       <w:pPr>
-        <w:spacing w:after="80"/>
-        <w:rPr>
-          <w:rFonts w:eastAsia="Times New Roman" w:cs="Times New Roman"/>
-          <w:color w:val="000000" w:themeColor="text1"/>
-        </w:rPr>
+        <w:pBdr>
+          <w:bottom w:val="single" w:sz="4" w:space="0" w:color="000000"/>
+        </w:pBdr>
       </w:pPr>
     </w:p>
     <w:p>
       <w:pPr>
-        <w:spacing w:after="80"/>
-        <w:rPr>
-          <w:b/>
-          <w:bCs/>
-          <w:sz w:val="24"/>
-          <w:szCs w:val="24"/>
-        </w:rPr>
+        <w:spacing w:before="60" w:after="240"/>
       </w:pPr>
-      <w:r>
-        <w:rPr>
-          <w:rFonts w:eastAsia="Times New Roman" w:cs="Times New Roman"/>
-          <w:color w:val="000000" w:themeColor="text1"/>
-        </w:rPr>
-        <w:t>Investigation</w:t>
-      </w:r>
-      <w:r>
-        <w:rPr>
-          <w:rFonts w:eastAsia="Times New Roman" w:cs="Times New Roman"/>
-          <w:color w:val="000000" w:themeColor="text1"/>
-        </w:rPr>
-        <w:t>:</w:t>
-      </w:r>
-      <w:r>
-        <w:rPr>
-          <w:rFonts w:eastAsia="Times New Roman" w:cs="Times New Roman"/>
-          <w:color w:val="000000" w:themeColor="text1"/>
-        </w:rPr>
-        <w:t xml:space="preserve"> </w:t>
-      </w:r>
-      <w:r>
-        <w:rPr>
-          <w:rFonts w:eastAsia="Times New Roman" w:cs="Times New Roman"/>
-          <w:color w:val="000000" w:themeColor="text1"/>
-        </w:rPr>
-        <w:t>{</w:t>
-      </w:r>
-      <w:proofErr w:type="gramStart"/>
-      <w:r>
-        <w:rPr>
-          <w:rFonts w:eastAsia="Times New Roman" w:cs="Times New Roman"/>
-          <w:color w:val="000000" w:themeColor="text1"/>
-        </w:rPr>
-        <w:t>d</w:t>
-      </w:r>
-      <w:r>
-        <w:rPr>
-          <w:sz w:val="18"/>
-          <w:szCs w:val="18"/>
-        </w:rPr>
-        <w:t>.</w:t>
-      </w:r>
-      <w:r>
-        <w:rPr>
-          <w:rFonts w:eastAsia="Times New Roman" w:cs="Times New Roman"/>
-          <w:color w:val="000000" w:themeColor="text1"/>
-        </w:rPr>
-        <w:t>investigation.name</w:t>
-      </w:r>
-      <w:proofErr w:type="gramEnd"/>
-      <w:r>
-        <w:rPr>
-          <w:rFonts w:eastAsia="Times New Roman" w:cs="Times New Roman"/>
-          <w:color w:val="000000" w:themeColor="text1"/>
-        </w:rPr>
-        <w:t>}</w:t>
-      </w:r>
     </w:p>
+    <w:tbl>
+      <w:tblPr>
+        <w:tblStyle w:val="PlainTable4"/>
+        <w:tblW w:w="10980" w:type="dxa"/>
+        <w:tblLayout w:type="fixed"/>
+        <w:tblLook w:val="06A0" w:firstRow="1" w:lastRow="0" w:firstColumn="1" w:lastColumn="0" w:noHBand="1" w:noVBand="1"/>
+      </w:tblPr>
+      <w:tblGrid>
+        <w:gridCol w:w="7380"/>
+        <w:gridCol w:w="3600"/>
+      </w:tblGrid>
+      <w:tr>
+        <w:trPr>
+          <w:cnfStyle w:val="100000000000" w:firstRow="1" w:lastRow="0" w:firstColumn="0" w:lastColumn="0" w:oddVBand="0" w:evenVBand="0" w:oddHBand="0" w:evenHBand="0" w:firstRowFirstColumn="0" w:firstRowLastColumn="0" w:lastRowFirstColumn="0" w:lastRowLastColumn="0"/>
+          <w:trHeight w:val="300"/>
+        </w:trPr>
+        <w:tc>
+          <w:tcPr>
+            <w:cnfStyle w:val="001000000000" w:firstRow="0" w:lastRow="0" w:firstColumn="1" w:lastColumn="0" w:oddVBand="0" w:evenVBand="0" w:oddHBand="0" w:evenHBand="0" w:firstRowFirstColumn="0" w:firstRowLastColumn="0" w:lastRowFirstColumn="0" w:lastRowLastColumn="0"/>
+            <w:tcW w:w="7380" w:type="dxa"/>
+          </w:tcPr>
+          <w:p>
+            <w:pPr>
+              <w:rPr>
+                <w:rFonts w:ascii="BC Sans" w:eastAsia="Times New Roman" w:hAnsi="BC Sans" w:cs="Times New Roman"/>
+                <w:b w:val="0"/>
+                <w:bCs w:val="0"/>
+                <w:color w:val="000000" w:themeColor="text1"/>
+                <w:sz w:val="20"/>
+                <w:szCs w:val="20"/>
+              </w:rPr>
+            </w:pPr>
+            <w:proofErr w:type="gramStart"/>
+            <w:r>
+              <w:rPr>
+                <w:rFonts w:ascii="BC Sans" w:eastAsia="Times New Roman" w:hAnsi="BC Sans" w:cs="Times New Roman"/>
+                <w:b w:val="0"/>
+                <w:bCs w:val="0"/>
+                <w:color w:val="000000" w:themeColor="text1"/>
+                <w:sz w:val="20"/>
+                <w:szCs w:val="20"/>
+              </w:rPr>
+              <w:t>Investigation</w:t>
+            </w:r>
+            <w:r>
+              <w:rPr>
+                <w:rFonts w:ascii="BC Sans" w:eastAsia="Times New Roman" w:hAnsi="BC Sans" w:cs="Times New Roman"/>
+                <w:b w:val="0"/>
+                <w:bCs w:val="0"/>
+                <w:color w:val="000000" w:themeColor="text1"/>
+                <w:sz w:val="20"/>
+                <w:szCs w:val="20"/>
+              </w:rPr>
+              <w:t>:</w:t>
+            </w:r>
+            <w:r>
+              <w:rPr>
+                <w:rFonts w:ascii="BC Sans" w:eastAsia="Times New Roman" w:hAnsi="BC Sans" w:cs="Times New Roman"/>
+                <w:b w:val="0"/>
+                <w:bCs w:val="0"/>
+                <w:color w:val="000000" w:themeColor="text1"/>
+                <w:sz w:val="20"/>
+                <w:szCs w:val="20"/>
+              </w:rPr>
+              <w:t xml:space="preserve"> </w:t>
+            </w:r>
+            <w:r>
+              <w:rPr>
+                <w:rFonts w:ascii="BC Sans" w:eastAsia="Times New Roman" w:hAnsi="BC Sans" w:cs="Times New Roman"/>
+                <w:b w:val="0"/>
+                <w:bCs w:val="0"/>
+                <w:color w:val="000000" w:themeColor="text1"/>
+                <w:sz w:val="20"/>
+                <w:szCs w:val="20"/>
+              </w:rPr>
+              <w:t>{</w:t>
+            </w:r>
+            <w:r>
+              <w:rPr>
+                <w:rFonts w:ascii="BC Sans" w:eastAsia="Times New Roman" w:hAnsi="BC Sans" w:cs="Times New Roman"/>
+                <w:b w:val="0"/>
+                <w:bCs w:val="0"/>
+                <w:color w:val="000000" w:themeColor="text1"/>
+                <w:sz w:val="20"/>
+                <w:szCs w:val="20"/>
+              </w:rPr>
+              <w:t>d</w:t>
+            </w:r>
+            <w:r>
+              <w:rPr>
+                <w:rFonts w:ascii="BC Sans" w:eastAsia="BC Sans" w:hAnsi="BC Sans" w:cs="BC Sans"/>
+                <w:sz w:val="18"/>
+                <w:szCs w:val="18"/>
+              </w:rPr>
+              <w:t>.</w:t>
+            </w:r>
+            <w:r>
+              <w:rPr>
+                <w:rFonts w:ascii="BC Sans" w:eastAsia="Times New Roman" w:hAnsi="BC Sans" w:cs="Times New Roman"/>
+                <w:b w:val="0"/>
+                <w:bCs w:val="0"/>
+                <w:color w:val="000000" w:themeColor="text1"/>
+                <w:sz w:val="20"/>
+                <w:szCs w:val="20"/>
+              </w:rPr>
+              <w:t>investigation.name</w:t>
+            </w:r>
+            <w:proofErr w:type="gramEnd"/>
+            <w:r>
+              <w:rPr>
+                <w:rFonts w:ascii="BC Sans" w:eastAsia="Times New Roman" w:hAnsi="BC Sans" w:cs="Times New Roman"/>
+                <w:b w:val="0"/>
+                <w:bCs w:val="0"/>
+                <w:color w:val="000000" w:themeColor="text1"/>
+                <w:sz w:val="20"/>
+                <w:szCs w:val="20"/>
+              </w:rPr>
+              <w:t>}</w:t>
+            </w:r>
+          </w:p>
+        </w:tc>
+        <w:tc>
+          <w:tcPr>
+            <w:tcW w:w="3600" w:type="dxa"/>
+          </w:tcPr>
+          <w:p>
+            <w:pPr>
+              <w:cnfStyle w:val="100000000000" w:firstRow="1" w:lastRow="0" w:firstColumn="0" w:lastColumn="0" w:oddVBand="0" w:evenVBand="0" w:oddHBand="0" w:evenHBand="0" w:firstRowFirstColumn="0" w:firstRowLastColumn="0" w:lastRowFirstColumn="0" w:lastRowLastColumn="0"/>
+            </w:pPr>
+            <w:proofErr w:type="gramStart"/>
+            <w:r>
+              <w:rPr>
+                <w:rFonts w:ascii="BC Sans" w:eastAsia="Times New Roman" w:hAnsi="BC Sans" w:cs="Times New Roman"/>
+                <w:b w:val="0"/>
+                <w:bCs w:val="0"/>
+                <w:color w:val="000000" w:themeColor="text1"/>
+                <w:sz w:val="20"/>
+                <w:szCs w:val="20"/>
+              </w:rPr>
+              <w:t>Description: {</w:t>
+            </w:r>
+            <w:proofErr w:type="spellStart"/>
+            <w:r>
+              <w:rPr>
+                <w:rFonts w:ascii="BC Sans" w:eastAsia="Times New Roman" w:hAnsi="BC Sans" w:cs="Times New Roman"/>
+                <w:b w:val="0"/>
+                <w:bCs w:val="0"/>
+                <w:color w:val="000000" w:themeColor="text1"/>
+                <w:sz w:val="20"/>
+                <w:szCs w:val="20"/>
+              </w:rPr>
+              <w:t>d.investigation</w:t>
+            </w:r>
+            <w:proofErr w:type="gramEnd"/>
+            <w:r>
+              <w:rPr>
+                <w:rFonts w:ascii="BC Sans" w:eastAsia="Times New Roman" w:hAnsi="BC Sans" w:cs="Times New Roman"/>
+                <w:b w:val="0"/>
+                <w:bCs w:val="0"/>
+                <w:color w:val="000000" w:themeColor="text1"/>
+                <w:sz w:val="20"/>
+                <w:szCs w:val="20"/>
+              </w:rPr>
+              <w:t>.description</w:t>
+            </w:r>
+            <w:proofErr w:type="spellEnd"/>
+            <w:r>
+              <w:rPr>
+                <w:rFonts w:ascii="BC Sans" w:eastAsia="Times New Roman" w:hAnsi="BC Sans" w:cs="Times New Roman"/>
+                <w:b w:val="0"/>
+                <w:bCs w:val="0"/>
+                <w:color w:val="000000" w:themeColor="text1"/>
+                <w:sz w:val="20"/>
+                <w:szCs w:val="20"/>
+              </w:rPr>
+              <w:t>}</w:t>
+            </w:r>
+          </w:p>
+        </w:tc>
+      </w:tr>
+    </w:tbl>
     <w:p>
       <w:pPr>
-        <w:spacing w:after="80"/>
-      </w:pPr>
-      <w:r>
-        <w:rPr>
-          <w:rFonts w:eastAsia="Times New Roman" w:cs="Times New Roman"/>
-          <w:color w:val="000000" w:themeColor="text1"/>
-        </w:rPr>
-        <w:t>Description: {</w:t>
-      </w:r>
-      <w:proofErr w:type="spellStart"/>
-      <w:proofErr w:type="gramStart"/>
-      <w:r>
-        <w:rPr>
-          <w:rFonts w:eastAsia="Times New Roman" w:cs="Times New Roman"/>
-          <w:color w:val="000000" w:themeColor="text1"/>
-        </w:rPr>
-        <w:t>d.investigation</w:t>
-      </w:r>
-      <w:proofErr w:type="gramEnd"/>
-      <w:r>
-        <w:rPr>
-          <w:rFonts w:eastAsia="Times New Roman" w:cs="Times New Roman"/>
-          <w:color w:val="000000" w:themeColor="text1"/>
-        </w:rPr>
-        <w:t>.description</w:t>
-      </w:r>
-      <w:proofErr w:type="spellEnd"/>
-      <w:r>
-        <w:rPr>
-          <w:rFonts w:eastAsia="Times New Roman" w:cs="Times New Roman"/>
-          <w:color w:val="000000" w:themeColor="text1"/>
-        </w:rPr>
-        <w:t>}</w:t>
-      </w:r>
-    </w:p>
-    <w:p>
-      <w:pPr>
-        <w:pBdr>
-          <w:bottom w:val="single" w:sz="4" w:space="0" w:color="000000"/>
-        </w:pBdr>
+        <w:spacing w:before="60" w:after="240"/>
       </w:pPr>
     </w:p>
     <w:p>
@@ -187,9 +257,9 @@
         <w:tblLook w:val="04A0" w:firstRow="1" w:lastRow="0" w:firstColumn="1" w:lastColumn="0" w:noHBand="0" w:noVBand="1"/>
       </w:tblPr>
       <w:tblGrid>
-        <w:gridCol w:w="3124"/>
-        <w:gridCol w:w="5797"/>
-        <w:gridCol w:w="1879"/>
+        <w:gridCol w:w="6493"/>
+        <w:gridCol w:w="2586"/>
+        <w:gridCol w:w="1721"/>
       </w:tblGrid>
       <w:tr>
         <w:trPr>
@@ -199,7 +269,7 @@
         <w:tc>
           <w:tcPr>
             <w:cnfStyle w:val="001000000100" w:firstRow="0" w:lastRow="0" w:firstColumn="1" w:lastColumn="0" w:oddVBand="0" w:evenVBand="0" w:oddHBand="0" w:evenHBand="0" w:firstRowFirstColumn="1" w:firstRowLastColumn="0" w:lastRowFirstColumn="0" w:lastRowLastColumn="0"/>
-            <w:tcW w:w="2835" w:type="dxa"/>
+            <w:tcW w:w="7549" w:type="dxa"/>
           </w:tcPr>
           <w:p>
             <w:pPr>
@@ -223,13 +293,13 @@
                 <w:szCs w:val="20"/>
                 <w14:ligatures w14:val="none"/>
               </w:rPr>
-              <w:t>Date/time actioned</w:t>
+              <w:t>Continuation Report</w:t>
             </w:r>
           </w:p>
         </w:tc>
         <w:tc>
           <w:tcPr>
-            <w:tcW w:w="6117" w:type="dxa"/>
+            <w:tcW w:w="1181" w:type="dxa"/>
           </w:tcPr>
           <w:p>
             <w:pPr>
@@ -254,13 +324,13 @@
                 <w:szCs w:val="20"/>
                 <w14:ligatures w14:val="none"/>
               </w:rPr>
-              <w:t>Continuation Report</w:t>
+              <w:t>Date/time actioned</w:t>
             </w:r>
           </w:p>
         </w:tc>
         <w:tc>
           <w:tcPr>
-            <w:tcW w:w="1848" w:type="dxa"/>
+            <w:tcW w:w="2070" w:type="dxa"/>
           </w:tcPr>
           <w:p>
             <w:pPr>
@@ -298,7 +368,7 @@
         <w:tc>
           <w:tcPr>
             <w:cnfStyle w:val="001000000000" w:firstRow="0" w:lastRow="0" w:firstColumn="1" w:lastColumn="0" w:oddVBand="0" w:evenVBand="0" w:oddHBand="0" w:evenHBand="0" w:firstRowFirstColumn="0" w:firstRowLastColumn="0" w:lastRowFirstColumn="0" w:lastRowLastColumn="0"/>
-            <w:tcW w:w="2835" w:type="dxa"/>
+            <w:tcW w:w="7549" w:type="dxa"/>
             <w:noWrap/>
             <w:vAlign w:val="center"/>
           </w:tcPr>
@@ -326,6 +396,7 @@
               <w:t>{</w:t>
             </w:r>
             <w:proofErr w:type="spellStart"/>
+            <w:proofErr w:type="gramStart"/>
             <w:r>
               <w:rPr>
                 <w:rFonts w:ascii="BC Sans" w:hAnsi="BC Sans"/>
@@ -338,6 +409,7 @@
               <w:t>d.activityNotes</w:t>
             </w:r>
             <w:proofErr w:type="spellEnd"/>
+            <w:proofErr w:type="gramEnd"/>
             <w:r>
               <w:rPr>
                 <w:rFonts w:ascii="BC Sans" w:hAnsi="BC Sans"/>
@@ -362,6 +434,7 @@
               <w:t>i</w:t>
             </w:r>
             <w:proofErr w:type="spellEnd"/>
+            <w:proofErr w:type="gramStart"/>
             <w:r>
               <w:rPr>
                 <w:rFonts w:ascii="BC Sans" w:hAnsi="BC Sans"/>
@@ -383,9 +456,10 @@
                 <w:sz w:val="20"/>
                 <w:szCs w:val="20"/>
               </w:rPr>
-              <w:t>actionedDate</w:t>
+              <w:t>contentText</w:t>
             </w:r>
             <w:proofErr w:type="spellEnd"/>
+            <w:proofErr w:type="gramEnd"/>
             <w:r>
               <w:rPr>
                 <w:rFonts w:ascii="BC Sans" w:hAnsi="BC Sans"/>
@@ -395,107 +469,13 @@
                 <w:sz w:val="20"/>
                 <w:szCs w:val="20"/>
               </w:rPr>
-              <w:t xml:space="preserve">}  </w:t>
-            </w:r>
-            <w:r>
-              <w:rPr>
-                <w:rFonts w:ascii="BC Sans" w:hAnsi="BC Sans"/>
-                <w:b w:val="0"/>
-                <w:bCs w:val="0"/>
-                <w:caps w:val="0"/>
-                <w:sz w:val="20"/>
-                <w:szCs w:val="20"/>
-              </w:rPr>
-              <w:t xml:space="preserve"> </w:t>
-            </w:r>
-            <w:r>
-              <w:rPr>
-                <w:rFonts w:ascii="BC Sans" w:hAnsi="BC Sans"/>
-                <w:b w:val="0"/>
-                <w:bCs w:val="0"/>
-                <w:caps w:val="0"/>
-                <w:sz w:val="20"/>
-                <w:szCs w:val="20"/>
-              </w:rPr>
-              <w:t>{</w:t>
-            </w:r>
-            <w:proofErr w:type="spellStart"/>
-            <w:r>
-              <w:rPr>
-                <w:rFonts w:ascii="BC Sans" w:hAnsi="BC Sans"/>
-                <w:b w:val="0"/>
-                <w:bCs w:val="0"/>
-                <w:caps w:val="0"/>
-                <w:sz w:val="20"/>
-                <w:szCs w:val="20"/>
-              </w:rPr>
-              <w:t>d.activityNotes</w:t>
-            </w:r>
-            <w:proofErr w:type="spellEnd"/>
-            <w:r>
-              <w:rPr>
-                <w:rFonts w:ascii="BC Sans" w:hAnsi="BC Sans"/>
-                <w:b w:val="0"/>
-                <w:bCs w:val="0"/>
-                <w:caps w:val="0"/>
-                <w:sz w:val="20"/>
-                <w:szCs w:val="20"/>
-              </w:rPr>
-              <w:t>[</w:t>
-            </w:r>
-            <w:proofErr w:type="spellStart"/>
-            <w:r>
-              <w:rPr>
-                <w:rFonts w:ascii="BC Sans" w:hAnsi="BC Sans"/>
-                <w:b w:val="0"/>
-                <w:bCs w:val="0"/>
-                <w:caps w:val="0"/>
-                <w:sz w:val="20"/>
-                <w:szCs w:val="20"/>
-              </w:rPr>
-              <w:t>i</w:t>
-            </w:r>
-            <w:proofErr w:type="spellEnd"/>
-            <w:r>
-              <w:rPr>
-                <w:rFonts w:ascii="BC Sans" w:hAnsi="BC Sans"/>
-                <w:b w:val="0"/>
-                <w:bCs w:val="0"/>
-                <w:caps w:val="0"/>
-                <w:sz w:val="20"/>
-                <w:szCs w:val="20"/>
-              </w:rPr>
-              <w:t>].</w:t>
-            </w:r>
-            <w:proofErr w:type="spellStart"/>
-            <w:r>
-              <w:rPr>
-                <w:rFonts w:ascii="BC Sans" w:hAnsi="BC Sans"/>
-                <w:b w:val="0"/>
-                <w:bCs w:val="0"/>
-                <w:caps w:val="0"/>
-                <w:sz w:val="20"/>
-                <w:szCs w:val="20"/>
-              </w:rPr>
-              <w:t>actionedTime</w:t>
-            </w:r>
-            <w:proofErr w:type="spellEnd"/>
-            <w:r>
-              <w:rPr>
-                <w:rFonts w:ascii="BC Sans" w:hAnsi="BC Sans"/>
-                <w:b w:val="0"/>
-                <w:bCs w:val="0"/>
-                <w:caps w:val="0"/>
-                <w:sz w:val="20"/>
-                <w:szCs w:val="20"/>
-              </w:rPr>
               <w:t>}</w:t>
             </w:r>
           </w:p>
         </w:tc>
         <w:tc>
           <w:tcPr>
-            <w:tcW w:w="6117" w:type="dxa"/>
+            <w:tcW w:w="1181" w:type="dxa"/>
             <w:tcBorders>
               <w:right w:val="single" w:sz="4" w:space="0" w:color="7F7F7F" w:themeColor="text1" w:themeTint="80"/>
             </w:tcBorders>
@@ -515,9 +495,10 @@
             </w:pPr>
             <w:r>
               <w:rPr>
-                <w:rFonts w:ascii="BC Sans" w:hAnsi="BC Sans"/>
-                <w:sz w:val="20"/>
-                <w:szCs w:val="20"/>
+                <w:rFonts w:ascii="BC Sans" w:eastAsia="Times New Roman" w:hAnsi="BC Sans" w:cs="Times New Roman"/>
+                <w:color w:val="000000" w:themeColor="text1"/>
+                <w:sz w:val="18"/>
+                <w:szCs w:val="18"/>
               </w:rPr>
               <w:t>{</w:t>
             </w:r>
@@ -525,9 +506,10 @@
             <w:proofErr w:type="gramStart"/>
             <w:r>
               <w:rPr>
-                <w:rFonts w:ascii="BC Sans" w:hAnsi="BC Sans"/>
-                <w:sz w:val="20"/>
-                <w:szCs w:val="20"/>
+                <w:rFonts w:ascii="BC Sans" w:eastAsia="Times New Roman" w:hAnsi="BC Sans" w:cs="Times New Roman"/>
+                <w:color w:val="000000" w:themeColor="text1"/>
+                <w:sz w:val="18"/>
+                <w:szCs w:val="18"/>
               </w:rPr>
               <w:t>d.activityNotes</w:t>
             </w:r>
@@ -535,18 +517,20 @@
             <w:proofErr w:type="gramEnd"/>
             <w:r>
               <w:rPr>
-                <w:rFonts w:ascii="BC Sans" w:hAnsi="BC Sans"/>
-                <w:sz w:val="20"/>
-                <w:szCs w:val="20"/>
+                <w:rFonts w:ascii="BC Sans" w:eastAsia="Times New Roman" w:hAnsi="BC Sans" w:cs="Times New Roman"/>
+                <w:color w:val="000000" w:themeColor="text1"/>
+                <w:sz w:val="18"/>
+                <w:szCs w:val="18"/>
               </w:rPr>
               <w:t>[</w:t>
             </w:r>
             <w:proofErr w:type="spellStart"/>
             <w:r>
               <w:rPr>
-                <w:rFonts w:ascii="BC Sans" w:hAnsi="BC Sans"/>
-                <w:sz w:val="20"/>
-                <w:szCs w:val="20"/>
+                <w:rFonts w:ascii="BC Sans" w:eastAsia="Times New Roman" w:hAnsi="BC Sans" w:cs="Times New Roman"/>
+                <w:color w:val="000000" w:themeColor="text1"/>
+                <w:sz w:val="18"/>
+                <w:szCs w:val="18"/>
               </w:rPr>
               <w:t>i</w:t>
             </w:r>
@@ -554,28 +538,111 @@
             <w:proofErr w:type="gramStart"/>
             <w:r>
               <w:rPr>
-                <w:rFonts w:ascii="BC Sans" w:hAnsi="BC Sans"/>
-                <w:sz w:val="20"/>
-                <w:szCs w:val="20"/>
+                <w:rFonts w:ascii="BC Sans" w:eastAsia="Times New Roman" w:hAnsi="BC Sans" w:cs="Times New Roman"/>
+                <w:color w:val="000000" w:themeColor="text1"/>
+                <w:sz w:val="18"/>
+                <w:szCs w:val="18"/>
               </w:rPr>
               <w:t>].</w:t>
             </w:r>
             <w:proofErr w:type="spellStart"/>
             <w:r>
               <w:rPr>
-                <w:rFonts w:ascii="BC Sans" w:hAnsi="BC Sans"/>
-                <w:sz w:val="20"/>
-                <w:szCs w:val="20"/>
-              </w:rPr>
-              <w:t>contentText</w:t>
+                <w:rFonts w:ascii="BC Sans" w:eastAsia="Times New Roman" w:hAnsi="BC Sans" w:cs="Times New Roman"/>
+                <w:color w:val="000000" w:themeColor="text1"/>
+                <w:sz w:val="18"/>
+                <w:szCs w:val="18"/>
+              </w:rPr>
+              <w:t>actionedDate</w:t>
+            </w:r>
+            <w:proofErr w:type="spellEnd"/>
+            <w:r>
+              <w:rPr>
+                <w:rFonts w:ascii="BC Sans" w:eastAsia="Times New Roman" w:hAnsi="BC Sans" w:cs="Times New Roman"/>
+                <w:color w:val="000000" w:themeColor="text1"/>
+                <w:sz w:val="18"/>
+                <w:szCs w:val="18"/>
+              </w:rPr>
+              <w:t xml:space="preserve">} </w:t>
+            </w:r>
+            <w:r>
+              <w:rPr>
+                <w:rFonts w:ascii="BC Sans" w:eastAsia="Times New Roman" w:hAnsi="BC Sans" w:cs="Times New Roman"/>
+                <w:color w:val="000000" w:themeColor="text1"/>
+                <w:sz w:val="18"/>
+                <w:szCs w:val="18"/>
+              </w:rPr>
+              <w:t xml:space="preserve"> </w:t>
+            </w:r>
+            <w:r>
+              <w:rPr>
+                <w:rFonts w:ascii="BC Sans" w:eastAsia="Times New Roman" w:hAnsi="BC Sans" w:cs="Times New Roman"/>
+                <w:color w:val="000000" w:themeColor="text1"/>
+                <w:sz w:val="18"/>
+                <w:szCs w:val="18"/>
+              </w:rPr>
+              <w:t>{</w:t>
+            </w:r>
+            <w:proofErr w:type="spellStart"/>
+            <w:r>
+              <w:rPr>
+                <w:rFonts w:ascii="BC Sans" w:eastAsia="Times New Roman" w:hAnsi="BC Sans" w:cs="Times New Roman"/>
+                <w:color w:val="000000" w:themeColor="text1"/>
+                <w:sz w:val="18"/>
+                <w:szCs w:val="18"/>
+              </w:rPr>
+              <w:t>d.activityNotes</w:t>
             </w:r>
             <w:proofErr w:type="spellEnd"/>
             <w:proofErr w:type="gramEnd"/>
             <w:r>
               <w:rPr>
-                <w:rFonts w:ascii="BC Sans" w:hAnsi="BC Sans"/>
-                <w:sz w:val="20"/>
-                <w:szCs w:val="20"/>
+                <w:rFonts w:ascii="BC Sans" w:eastAsia="Times New Roman" w:hAnsi="BC Sans" w:cs="Times New Roman"/>
+                <w:color w:val="000000" w:themeColor="text1"/>
+                <w:sz w:val="18"/>
+                <w:szCs w:val="18"/>
+              </w:rPr>
+              <w:t>[</w:t>
+            </w:r>
+            <w:proofErr w:type="spellStart"/>
+            <w:r>
+              <w:rPr>
+                <w:rFonts w:ascii="BC Sans" w:eastAsia="Times New Roman" w:hAnsi="BC Sans" w:cs="Times New Roman"/>
+                <w:color w:val="000000" w:themeColor="text1"/>
+                <w:sz w:val="18"/>
+                <w:szCs w:val="18"/>
+              </w:rPr>
+              <w:t>i</w:t>
+            </w:r>
+            <w:proofErr w:type="spellEnd"/>
+            <w:proofErr w:type="gramStart"/>
+            <w:r>
+              <w:rPr>
+                <w:rFonts w:ascii="BC Sans" w:eastAsia="Times New Roman" w:hAnsi="BC Sans" w:cs="Times New Roman"/>
+                <w:color w:val="000000" w:themeColor="text1"/>
+                <w:sz w:val="18"/>
+                <w:szCs w:val="18"/>
+              </w:rPr>
+              <w:t>].</w:t>
+            </w:r>
+            <w:proofErr w:type="spellStart"/>
+            <w:r>
+              <w:rPr>
+                <w:rFonts w:ascii="BC Sans" w:eastAsia="Times New Roman" w:hAnsi="BC Sans" w:cs="Times New Roman"/>
+                <w:color w:val="000000" w:themeColor="text1"/>
+                <w:sz w:val="18"/>
+                <w:szCs w:val="18"/>
+              </w:rPr>
+              <w:t>actionedTime</w:t>
+            </w:r>
+            <w:proofErr w:type="spellEnd"/>
+            <w:proofErr w:type="gramEnd"/>
+            <w:r>
+              <w:rPr>
+                <w:rFonts w:ascii="BC Sans" w:eastAsia="Times New Roman" w:hAnsi="BC Sans" w:cs="Times New Roman"/>
+                <w:color w:val="000000" w:themeColor="text1"/>
+                <w:sz w:val="18"/>
+                <w:szCs w:val="18"/>
               </w:rPr>
               <w:t>}</w:t>
             </w:r>
@@ -583,7 +650,7 @@
         </w:tc>
         <w:tc>
           <w:tcPr>
-            <w:tcW w:w="1848" w:type="dxa"/>
+            <w:tcW w:w="2070" w:type="dxa"/>
             <w:tcBorders>
               <w:left w:val="single" w:sz="4" w:space="0" w:color="7F7F7F" w:themeColor="text1" w:themeTint="80"/>
             </w:tcBorders>
@@ -790,7 +857,7 @@
         <w:tc>
           <w:tcPr>
             <w:cnfStyle w:val="001000000000" w:firstRow="0" w:lastRow="0" w:firstColumn="1" w:lastColumn="0" w:oddVBand="0" w:evenVBand="0" w:oddHBand="0" w:evenHBand="0" w:firstRowFirstColumn="0" w:firstRowLastColumn="0" w:lastRowFirstColumn="0" w:lastRowLastColumn="0"/>
-            <w:tcW w:w="2835" w:type="dxa"/>
+            <w:tcW w:w="7549" w:type="dxa"/>
             <w:noWrap/>
             <w:vAlign w:val="center"/>
           </w:tcPr>
@@ -864,9 +931,10 @@
                 <w:sz w:val="20"/>
                 <w:szCs w:val="20"/>
               </w:rPr>
-              <w:t>actionedDate</w:t>
+              <w:t>contentText</w:t>
             </w:r>
             <w:proofErr w:type="spellEnd"/>
+            <w:proofErr w:type="gramEnd"/>
             <w:r>
               <w:rPr>
                 <w:rFonts w:ascii="BC Sans" w:hAnsi="BC Sans"/>
@@ -878,97 +946,11 @@
               </w:rPr>
               <w:t>}</w:t>
             </w:r>
-            <w:proofErr w:type="gramEnd"/>
-            <w:r>
-              <w:rPr>
-                <w:rFonts w:ascii="BC Sans" w:hAnsi="BC Sans"/>
-                <w:b w:val="0"/>
-                <w:bCs w:val="0"/>
-                <w:caps w:val="0"/>
-                <w:sz w:val="20"/>
-                <w:szCs w:val="20"/>
-              </w:rPr>
-              <w:t xml:space="preserve"> </w:t>
-            </w:r>
-            <w:proofErr w:type="gramStart"/>
-            <w:r>
-              <w:rPr>
-                <w:rFonts w:ascii="BC Sans" w:hAnsi="BC Sans"/>
-                <w:b w:val="0"/>
-                <w:bCs w:val="0"/>
-                <w:caps w:val="0"/>
-                <w:sz w:val="20"/>
-                <w:szCs w:val="20"/>
-              </w:rPr>
-              <w:t xml:space="preserve">  {</w:t>
-            </w:r>
-            <w:proofErr w:type="spellStart"/>
-            <w:r>
-              <w:rPr>
-                <w:rFonts w:ascii="BC Sans" w:hAnsi="BC Sans"/>
-                <w:b w:val="0"/>
-                <w:bCs w:val="0"/>
-                <w:caps w:val="0"/>
-                <w:sz w:val="20"/>
-                <w:szCs w:val="20"/>
-              </w:rPr>
-              <w:t>d.activityNotes</w:t>
-            </w:r>
-            <w:proofErr w:type="spellEnd"/>
-            <w:proofErr w:type="gramEnd"/>
-            <w:r>
-              <w:rPr>
-                <w:rFonts w:ascii="BC Sans" w:hAnsi="BC Sans"/>
-                <w:b w:val="0"/>
-                <w:bCs w:val="0"/>
-                <w:caps w:val="0"/>
-                <w:sz w:val="20"/>
-                <w:szCs w:val="20"/>
-              </w:rPr>
-              <w:t>[i+1</w:t>
-            </w:r>
-            <w:proofErr w:type="gramStart"/>
-            <w:r>
-              <w:rPr>
-                <w:rFonts w:ascii="BC Sans" w:hAnsi="BC Sans"/>
-                <w:b w:val="0"/>
-                <w:bCs w:val="0"/>
-                <w:caps w:val="0"/>
-                <w:sz w:val="20"/>
-                <w:szCs w:val="20"/>
-              </w:rPr>
-              <w:t>].</w:t>
-            </w:r>
-            <w:proofErr w:type="spellStart"/>
-            <w:r>
-              <w:rPr>
-                <w:rFonts w:ascii="BC Sans" w:hAnsi="BC Sans"/>
-                <w:b w:val="0"/>
-                <w:bCs w:val="0"/>
-                <w:caps w:val="0"/>
-                <w:sz w:val="20"/>
-                <w:szCs w:val="20"/>
-              </w:rPr>
-              <w:t>actionedTime</w:t>
-            </w:r>
-            <w:proofErr w:type="spellEnd"/>
-            <w:proofErr w:type="gramEnd"/>
-            <w:r>
-              <w:rPr>
-                <w:rFonts w:ascii="BC Sans" w:hAnsi="BC Sans"/>
-                <w:b w:val="0"/>
-                <w:bCs w:val="0"/>
-                <w:caps w:val="0"/>
-                <w:sz w:val="20"/>
-                <w:szCs w:val="20"/>
-              </w:rPr>
-              <w:t>}</w:t>
-            </w:r>
           </w:p>
         </w:tc>
         <w:tc>
           <w:tcPr>
-            <w:tcW w:w="6117" w:type="dxa"/>
+            <w:tcW w:w="1181" w:type="dxa"/>
             <w:tcBorders>
               <w:right w:val="single" w:sz="4" w:space="0" w:color="7F7F7F" w:themeColor="text1" w:themeTint="80"/>
             </w:tcBorders>
@@ -987,9 +969,10 @@
             </w:pPr>
             <w:r>
               <w:rPr>
-                <w:rFonts w:ascii="BC Sans" w:hAnsi="BC Sans"/>
-                <w:sz w:val="20"/>
-                <w:szCs w:val="20"/>
+                <w:rFonts w:ascii="BC Sans" w:eastAsia="Times New Roman" w:hAnsi="BC Sans" w:cs="Times New Roman"/>
+                <w:color w:val="000000" w:themeColor="text1"/>
+                <w:sz w:val="18"/>
+                <w:szCs w:val="18"/>
               </w:rPr>
               <w:t>{</w:t>
             </w:r>
@@ -997,9 +980,10 @@
             <w:proofErr w:type="gramStart"/>
             <w:r>
               <w:rPr>
-                <w:rFonts w:ascii="BC Sans" w:hAnsi="BC Sans"/>
-                <w:sz w:val="20"/>
-                <w:szCs w:val="20"/>
+                <w:rFonts w:ascii="BC Sans" w:eastAsia="Times New Roman" w:hAnsi="BC Sans" w:cs="Times New Roman"/>
+                <w:color w:val="000000" w:themeColor="text1"/>
+                <w:sz w:val="18"/>
+                <w:szCs w:val="18"/>
               </w:rPr>
               <w:t>d.activityNotes</w:t>
             </w:r>
@@ -1007,37 +991,110 @@
             <w:proofErr w:type="gramEnd"/>
             <w:r>
               <w:rPr>
-                <w:rFonts w:ascii="BC Sans" w:hAnsi="BC Sans"/>
-                <w:sz w:val="20"/>
-                <w:szCs w:val="20"/>
+                <w:rFonts w:ascii="BC Sans" w:eastAsia="Times New Roman" w:hAnsi="BC Sans" w:cs="Times New Roman"/>
+                <w:color w:val="000000" w:themeColor="text1"/>
+                <w:sz w:val="18"/>
+                <w:szCs w:val="18"/>
               </w:rPr>
               <w:t>[i+1</w:t>
             </w:r>
             <w:proofErr w:type="gramStart"/>
             <w:r>
               <w:rPr>
-                <w:rFonts w:ascii="BC Sans" w:hAnsi="BC Sans"/>
-                <w:sz w:val="20"/>
-                <w:szCs w:val="20"/>
+                <w:rFonts w:ascii="BC Sans" w:eastAsia="Times New Roman" w:hAnsi="BC Sans" w:cs="Times New Roman"/>
+                <w:color w:val="000000" w:themeColor="text1"/>
+                <w:sz w:val="18"/>
+                <w:szCs w:val="18"/>
               </w:rPr>
               <w:t>].</w:t>
             </w:r>
             <w:proofErr w:type="spellStart"/>
             <w:r>
               <w:rPr>
-                <w:rFonts w:ascii="BC Sans" w:hAnsi="BC Sans"/>
-                <w:sz w:val="20"/>
-                <w:szCs w:val="20"/>
-              </w:rPr>
-              <w:t>contentText</w:t>
+                <w:rFonts w:ascii="BC Sans" w:eastAsia="Times New Roman" w:hAnsi="BC Sans" w:cs="Times New Roman"/>
+                <w:color w:val="000000" w:themeColor="text1"/>
+                <w:sz w:val="18"/>
+                <w:szCs w:val="18"/>
+              </w:rPr>
+              <w:t>actionedDate</w:t>
+            </w:r>
+            <w:proofErr w:type="spellEnd"/>
+            <w:r>
+              <w:rPr>
+                <w:rFonts w:ascii="BC Sans" w:eastAsia="Times New Roman" w:hAnsi="BC Sans" w:cs="Times New Roman"/>
+                <w:color w:val="000000" w:themeColor="text1"/>
+                <w:sz w:val="18"/>
+                <w:szCs w:val="18"/>
+              </w:rPr>
+              <w:t xml:space="preserve">} </w:t>
+            </w:r>
+            <w:r>
+              <w:rPr>
+                <w:rFonts w:ascii="BC Sans" w:eastAsia="Times New Roman" w:hAnsi="BC Sans" w:cs="Times New Roman"/>
+                <w:color w:val="000000" w:themeColor="text1"/>
+                <w:sz w:val="18"/>
+                <w:szCs w:val="18"/>
+              </w:rPr>
+              <w:t xml:space="preserve"> </w:t>
+            </w:r>
+            <w:r>
+              <w:rPr>
+                <w:rFonts w:ascii="BC Sans" w:eastAsia="Times New Roman" w:hAnsi="BC Sans" w:cs="Times New Roman"/>
+                <w:color w:val="000000" w:themeColor="text1"/>
+                <w:sz w:val="18"/>
+                <w:szCs w:val="18"/>
+              </w:rPr>
+              <w:t>{</w:t>
+            </w:r>
+            <w:proofErr w:type="spellStart"/>
+            <w:r>
+              <w:rPr>
+                <w:rFonts w:ascii="BC Sans" w:eastAsia="Times New Roman" w:hAnsi="BC Sans" w:cs="Times New Roman"/>
+                <w:color w:val="000000" w:themeColor="text1"/>
+                <w:sz w:val="18"/>
+                <w:szCs w:val="18"/>
+              </w:rPr>
+              <w:t>d.activityNotes</w:t>
             </w:r>
             <w:proofErr w:type="spellEnd"/>
             <w:proofErr w:type="gramEnd"/>
             <w:r>
               <w:rPr>
-                <w:rFonts w:ascii="BC Sans" w:hAnsi="BC Sans"/>
-                <w:sz w:val="20"/>
-                <w:szCs w:val="20"/>
+                <w:rFonts w:ascii="BC Sans" w:eastAsia="Times New Roman" w:hAnsi="BC Sans" w:cs="Times New Roman"/>
+                <w:color w:val="000000" w:themeColor="text1"/>
+                <w:sz w:val="18"/>
+                <w:szCs w:val="18"/>
+              </w:rPr>
+              <w:t>[i+1</w:t>
+            </w:r>
+            <w:proofErr w:type="gramStart"/>
+            <w:r>
+              <w:rPr>
+                <w:rFonts w:ascii="BC Sans" w:eastAsia="Times New Roman" w:hAnsi="BC Sans" w:cs="Times New Roman"/>
+                <w:color w:val="000000" w:themeColor="text1"/>
+                <w:sz w:val="18"/>
+                <w:szCs w:val="18"/>
+              </w:rPr>
+              <w:t>].</w:t>
+            </w:r>
+            <w:proofErr w:type="spellStart"/>
+            <w:r>
+              <w:rPr>
+                <w:rFonts w:ascii="BC Sans" w:eastAsia="Times New Roman" w:hAnsi="BC Sans" w:cs="Times New Roman"/>
+                <w:color w:val="000000" w:themeColor="text1"/>
+                <w:sz w:val="18"/>
+                <w:szCs w:val="18"/>
+              </w:rPr>
+              <w:t>actionedTime</w:t>
+            </w:r>
+            <w:proofErr w:type="spellEnd"/>
+            <w:proofErr w:type="gramEnd"/>
+            <w:r>
+              <w:rPr>
+                <w:rFonts w:ascii="BC Sans" w:eastAsia="Times New Roman" w:hAnsi="BC Sans" w:cs="Times New Roman"/>
+                <w:color w:val="000000" w:themeColor="text1"/>
+                <w:sz w:val="18"/>
+                <w:szCs w:val="18"/>
               </w:rPr>
               <w:t>}</w:t>
             </w:r>
@@ -1045,7 +1102,7 @@
         </w:tc>
         <w:tc>
           <w:tcPr>
-            <w:tcW w:w="1848" w:type="dxa"/>
+            <w:tcW w:w="2070" w:type="dxa"/>
             <w:tcBorders>
               <w:left w:val="single" w:sz="4" w:space="0" w:color="7F7F7F" w:themeColor="text1" w:themeTint="80"/>
             </w:tcBorders>

</xml_diff>